<commit_message>
Update script: simpler grading slide, remove methods slide
Co-Authored-By: Claude Opus 5.5 <noreply@anthropic.com>
Claude-Session: https://claude.ai/code/session_0166dwtN5G5mFvTnNQ48dqRe
</commit_message>
<xml_diff>
--- a/Guion_Brain_Aneurysms.docx
+++ b/Guion_Brain_Aneurysms.docx
@@ -153,7 +153,7 @@
               <w:t xml:space="preserve">Tiempo objetivo:</w:t>
             </w:r>
             <w:r>
-              <w:t xml:space="preserve"> 15 min en total (con vídeo). A ≈ 8,3 min · B ≈ 6,6 min.</w:t>
+              <w:t xml:space="preserve"> 15 min en total (con vídeo). Ahora ≈ 14,3 min: A ≈ 8,3 min · B ≈ 6,0 min.</w:t>
             </w:r>
           </w:p>
           <w:p>
@@ -170,7 +170,7 @@
               <w:t xml:space="preserve">Para equilibrar:</w:t>
             </w:r>
             <w:r>
-              <w:t xml:space="preserve"> si B dice la discusión (diapositiva 20), queda A ≈ 7,6 min · B ≈ 7,3 min.</w:t>
+              <w:t xml:space="preserve"> si B dice la discusión (diapositiva 19), queda A ≈ 7,6 min · B ≈ 6,7 min.</w:t>
             </w:r>
           </w:p>
         </w:tc>
@@ -1560,6 +1560,41 @@
     </w:p>
     <w:p>
       <w:pPr>
+        <w:spacing w:after="120"/>
+      </w:pPr>
+      <w:r>
+        <w:rPr>
+          <w:b/>
+          <w:bCs/>
+        </w:rPr>
+        <w:t xml:space="preserve">Para qué sirven:</w:t>
+      </w:r>
+      <w:r>
+        <w:t xml:space="preserve"> dar al paciente un número de leve a grave, para decidir el tratamiento, prever la evolución y que todos los hospitales hablen el mismo idioma. Hay varias porque miden cosas distintas: unas miran </w:t>
+      </w:r>
+      <w:r>
+        <w:rPr>
+          <w:b/>
+          <w:bCs/>
+        </w:rPr>
+        <w:t xml:space="preserve">al paciente</w:t>
+      </w:r>
+      <w:r>
+        <w:t xml:space="preserve"> y otra mira </w:t>
+      </w:r>
+      <w:r>
+        <w:rPr>
+          <w:b/>
+          <w:bCs/>
+        </w:rPr>
+        <w:t xml:space="preserve">el CT</w:t>
+      </w:r>
+      <w:r>
+        <w:t xml:space="preserve">. Se usan juntas, no se sustituyen.</w:t>
+      </w:r>
+    </w:p>
+    <w:p>
+      <w:pPr>
         <w:pStyle w:val="ListParagraph"/>
         <w:numPr>
           <w:ilvl w:val="0"/>
@@ -7722,6 +7757,23 @@
               <w:t xml:space="preserve"> endovascular /en-doh-VAS-kyuh-ler/ · mortality /mor-TAL-ih-tee/ · recognise /REK-ug-nize/</w:t>
             </w:r>
           </w:p>
+          <w:p>
+            <w:pPr>
+              <w:keepNext w:val="false"/>
+              <w:keepLines/>
+              <w:spacing w:after="60"/>
+            </w:pPr>
+            <w:r>
+              <w:rPr>
+                <w:b/>
+                <w:bCs/>
+              </w:rPr>
+              <w:t xml:space="preserve">Relevo:</w:t>
+            </w:r>
+            <w:r>
+              <w:t xml:space="preserve"> B → A: "Now my colleague will explain what a brain aneurysm is."</w:t>
+            </w:r>
+          </w:p>
         </w:tc>
       </w:tr>
     </w:tbl>
@@ -7783,7 +7835,7 @@
                 <w:sz w:val="26"/>
                 <w:szCs w:val="26"/>
               </w:rPr>
-              <w:t xml:space="preserve">6 · Procedures &amp; Methods</w:t>
+              <w:t xml:space="preserve">6 · Definition</w:t>
             </w:r>
             <w:r>
               <w:rPr>
@@ -7791,7 +7843,7 @@
                 <w:sz w:val="22"/>
                 <w:szCs w:val="22"/>
               </w:rPr>
-              <w:t xml:space="preserve">     Habla: B  ·  ≈ 25 s</w:t>
+              <w:t xml:space="preserve">     Habla: A + B  ·  ≈ 45 s</w:t>
             </w:r>
           </w:p>
         </w:tc>
@@ -7886,7 +7938,7 @@
               <w:bottom w:val="single" w:color="C9D3DD" w:sz="4"/>
               <w:right w:val="single" w:color="C9D3DD" w:sz="4"/>
             </w:tcBorders>
-            <w:shd w:fill="FBEDE7" w:color="auto" w:val="clear"/>
+            <w:shd w:fill="E6F0F8" w:color="auto" w:val="clear"/>
             <w:tcMar>
               <w:top w:type="dxa" w:w="100"/>
               <w:left w:type="dxa" w:w="140"/>
@@ -7901,27 +7953,14 @@
               <w:spacing w:after="60"/>
             </w:pPr>
             <w:r>
-              <w:t xml:space="preserve">Se realizó una revisión bibliográfica. Se estudiaron guías clínicas americanas y europeas. Además, se evaluaron los ensayos y </w:t>
-            </w:r>
-            <w:r>
-              <w:rPr>
-                <w:b/>
-                <w:bCs/>
-              </w:rPr>
-              <w:t xml:space="preserve">meta-analyses</w:t>
-            </w:r>
-            <w:r>
-              <w:t xml:space="preserve"> más importantes. Por último, se extrajeron datos sobre sexo, edad y región. Todas las fuentes se encontraron en </w:t>
-            </w:r>
-            <w:r>
-              <w:rPr>
-                <w:b/>
-                <w:bCs/>
-              </w:rPr>
-              <w:t xml:space="preserve">PubMed</w:t>
-            </w:r>
-            <w:r>
-              <w:t xml:space="preserve">.</w:t>
+              <w:rPr>
+                <w:b/>
+                <w:bCs/>
+              </w:rPr>
+              <w:t xml:space="preserve">[A] </w:t>
+            </w:r>
+            <w:r>
+              <w:t xml:space="preserve">Un aneurisma cerebral es una zona débil en la pared de una arteria. La pared se abomba y se llena de sangre, como un pequeño globo. Los aneurismas suelen aparecer donde las arterias se dividen.</w:t>
             </w:r>
           </w:p>
         </w:tc>
@@ -7934,7 +7973,7 @@
               <w:bottom w:val="single" w:color="C9D3DD" w:sz="4"/>
               <w:right w:val="single" w:color="C9D3DD" w:sz="4"/>
             </w:tcBorders>
-            <w:shd w:fill="FBEDE7" w:color="auto" w:val="clear"/>
+            <w:shd w:fill="E6F0F8" w:color="auto" w:val="clear"/>
             <w:tcMar>
               <w:top w:type="dxa" w:w="100"/>
               <w:left w:type="dxa" w:w="140"/>
@@ -7949,27 +7988,14 @@
               <w:spacing w:after="60"/>
             </w:pPr>
             <w:r>
-              <w:t xml:space="preserve">A bibliographic review was performed. American and European clinical guidelines were studied. Moreover, the most important trials and </w:t>
-            </w:r>
-            <w:r>
-              <w:rPr>
-                <w:b/>
-                <w:bCs/>
-              </w:rPr>
-              <w:t xml:space="preserve">meta-analyses</w:t>
-            </w:r>
-            <w:r>
-              <w:t xml:space="preserve"> were assessed. Finally, data on sex, age and region were extracted. All sources were found in </w:t>
-            </w:r>
-            <w:r>
-              <w:rPr>
-                <w:b/>
-                <w:bCs/>
-              </w:rPr>
-              <w:t xml:space="preserve">PubMed</w:t>
-            </w:r>
-            <w:r>
-              <w:t xml:space="preserve">.</w:t>
+              <w:rPr>
+                <w:b/>
+                <w:bCs/>
+              </w:rPr>
+              <w:t xml:space="preserve">[A] </w:t>
+            </w:r>
+            <w:r>
+              <w:t xml:space="preserve">A brain aneurysm is a weak area in the wall of an artery. The wall bulges and fills with blood, like a small balloon. Aneurysms usually appear where arteries divide.</w:t>
             </w:r>
           </w:p>
         </w:tc>
@@ -7980,6 +8006,151 @@
         </w:trPr>
         <w:tc>
           <w:tcPr>
+            <w:tcW w:type="dxa" w:w="4819"/>
+            <w:tcBorders>
+              <w:top w:val="single" w:color="C9D3DD" w:sz="4"/>
+              <w:left w:val="single" w:color="C9D3DD" w:sz="4"/>
+              <w:bottom w:val="single" w:color="C9D3DD" w:sz="4"/>
+              <w:right w:val="single" w:color="C9D3DD" w:sz="4"/>
+            </w:tcBorders>
+            <w:shd w:fill="FBEDE7" w:color="auto" w:val="clear"/>
+            <w:tcMar>
+              <w:top w:type="dxa" w:w="100"/>
+              <w:left w:type="dxa" w:w="140"/>
+              <w:bottom w:type="dxa" w:w="100"/>
+              <w:right w:type="dxa" w:w="140"/>
+            </w:tcMar>
+          </w:tcPr>
+          <w:p>
+            <w:pPr>
+              <w:keepNext/>
+              <w:keepLines/>
+              <w:spacing w:after="60"/>
+            </w:pPr>
+            <w:r>
+              <w:rPr>
+                <w:b/>
+                <w:bCs/>
+              </w:rPr>
+              <w:t xml:space="preserve">[B] </w:t>
+            </w:r>
+            <w:r>
+              <w:t xml:space="preserve">Cuando la pared se rompe, la sangre pasa al espacio subaracnoideo, entre la aracnoides y la piamadre. Esto se llama </w:t>
+            </w:r>
+            <w:r>
+              <w:rPr>
+                <w:b/>
+                <w:bCs/>
+              </w:rPr>
+              <w:t xml:space="preserve">subarachnoid hemorrhage</w:t>
+            </w:r>
+            <w:r>
+              <w:t xml:space="preserve">. En este </w:t>
+            </w:r>
+            <w:r>
+              <w:rPr>
+                <w:b/>
+                <w:bCs/>
+              </w:rPr>
+              <w:t xml:space="preserve">CT</w:t>
+            </w:r>
+            <w:r>
+              <w:t xml:space="preserve">, la flecha señala la sangre. La causa principal de este sangrado es un aneurisma roto.</w:t>
+            </w:r>
+          </w:p>
+        </w:tc>
+        <w:tc>
+          <w:tcPr>
+            <w:tcW w:type="dxa" w:w="4819"/>
+            <w:tcBorders>
+              <w:top w:val="single" w:color="C9D3DD" w:sz="4"/>
+              <w:left w:val="single" w:color="C9D3DD" w:sz="4"/>
+              <w:bottom w:val="single" w:color="C9D3DD" w:sz="4"/>
+              <w:right w:val="single" w:color="C9D3DD" w:sz="4"/>
+            </w:tcBorders>
+            <w:shd w:fill="FBEDE7" w:color="auto" w:val="clear"/>
+            <w:tcMar>
+              <w:top w:type="dxa" w:w="100"/>
+              <w:left w:type="dxa" w:w="140"/>
+              <w:bottom w:type="dxa" w:w="100"/>
+              <w:right w:type="dxa" w:w="140"/>
+            </w:tcMar>
+          </w:tcPr>
+          <w:p>
+            <w:pPr>
+              <w:keepNext/>
+              <w:keepLines/>
+              <w:spacing w:after="60"/>
+            </w:pPr>
+            <w:r>
+              <w:rPr>
+                <w:b/>
+                <w:bCs/>
+              </w:rPr>
+              <w:t xml:space="preserve">[B] </w:t>
+            </w:r>
+            <w:r>
+              <w:t xml:space="preserve">When the wall breaks, blood goes into the </w:t>
+            </w:r>
+            <w:r>
+              <w:rPr>
+                <w:b/>
+                <w:bCs/>
+              </w:rPr>
+              <w:t xml:space="preserve">subarachnoid</w:t>
+            </w:r>
+            <w:r>
+              <w:t xml:space="preserve"> space, between the </w:t>
+            </w:r>
+            <w:r>
+              <w:rPr>
+                <w:b/>
+                <w:bCs/>
+              </w:rPr>
+              <w:t xml:space="preserve">arachnoid</w:t>
+            </w:r>
+            <w:r>
+              <w:t xml:space="preserve"> and the </w:t>
+            </w:r>
+            <w:r>
+              <w:rPr>
+                <w:b/>
+                <w:bCs/>
+              </w:rPr>
+              <w:t xml:space="preserve">pia mater</w:t>
+            </w:r>
+            <w:r>
+              <w:t xml:space="preserve">. This is called </w:t>
+            </w:r>
+            <w:r>
+              <w:rPr>
+                <w:b/>
+                <w:bCs/>
+              </w:rPr>
+              <w:t xml:space="preserve">subarachnoid hemorrhage</w:t>
+            </w:r>
+            <w:r>
+              <w:t xml:space="preserve">. In this </w:t>
+            </w:r>
+            <w:r>
+              <w:rPr>
+                <w:b/>
+                <w:bCs/>
+              </w:rPr>
+              <w:t xml:space="preserve">CT</w:t>
+            </w:r>
+            <w:r>
+              <w:t xml:space="preserve">, the arrow shows the blood. The main cause of this bleeding is a ruptured aneurysm.</w:t>
+            </w:r>
+          </w:p>
+        </w:tc>
+      </w:tr>
+      <w:tr>
+        <w:trPr>
+          <w:cantSplit/>
+        </w:trPr>
+        <w:tc>
+          <w:tcPr>
             <w:tcW w:type="dxa" w:w="9638"/>
             <w:gridSpan w:val="2"/>
             <w:tcBorders>
@@ -8010,7 +8181,24 @@
               <w:t xml:space="preserve">Pronunciación:</w:t>
             </w:r>
             <w:r>
-              <w:t xml:space="preserve"> guidelines /GAIDE-lines/ · studied /STUH-deed/ · assessed /uh-SEST/ · extracted /ik-STRAK-tid/</w:t>
+              <w:t xml:space="preserve"> subarachnoid /sub-uh-RAK-noid/ · hemorrhage /HEM-uh-rij/ · bulges /BUL-jiz/ · balloon /buh-LOON/</w:t>
+            </w:r>
+          </w:p>
+          <w:p>
+            <w:pPr>
+              <w:keepNext w:val="false"/>
+              <w:keepLines/>
+              <w:spacing w:after="60"/>
+            </w:pPr>
+            <w:r>
+              <w:rPr>
+                <w:b/>
+                <w:bCs/>
+              </w:rPr>
+              <w:t xml:space="preserve">Relevo:</w:t>
+            </w:r>
+            <w:r>
+              <w:t xml:space="preserve"> A → B: A termina con "…where arteries divide." y B entra con "And when the wall breaks…"</w:t>
             </w:r>
           </w:p>
         </w:tc>
@@ -8074,7 +8262,7 @@
                 <w:sz w:val="26"/>
                 <w:szCs w:val="26"/>
               </w:rPr>
-              <w:t xml:space="preserve">7 · Definition</w:t>
+              <w:t xml:space="preserve">7 · Types · Shape &amp; size</w:t>
             </w:r>
             <w:r>
               <w:rPr>
@@ -8082,7 +8270,7 @@
                 <w:sz w:val="22"/>
                 <w:szCs w:val="22"/>
               </w:rPr>
-              <w:t xml:space="preserve">     Habla: A + B  ·  ≈ 45 s</w:t>
+              <w:t xml:space="preserve">     Habla: A  ·  ≈ 45 s</w:t>
             </w:r>
           </w:p>
         </w:tc>
@@ -8192,14 +8380,57 @@
               <w:spacing w:after="60"/>
             </w:pPr>
             <w:r>
-              <w:rPr>
-                <w:b/>
-                <w:bCs/>
-              </w:rPr>
-              <w:t xml:space="preserve">[A] </w:t>
-            </w:r>
-            <w:r>
-              <w:t xml:space="preserve">Un aneurisma cerebral es una zona débil en la pared de una arteria. La pared se abomba y se llena de sangre, como un pequeño globo. Los aneurismas suelen aparecer donde las arterias se dividen.</w:t>
+              <w:t xml:space="preserve">Los aneurismas se clasifican por forma y por tamaño. Los </w:t>
+            </w:r>
+            <w:r>
+              <w:rPr>
+                <w:b/>
+                <w:bCs/>
+              </w:rPr>
+              <w:t xml:space="preserve">saccular</w:t>
+            </w:r>
+            <w:r>
+              <w:t xml:space="preserve"> parecen una baya (</w:t>
+            </w:r>
+            <w:r>
+              <w:rPr>
+                <w:b/>
+                <w:bCs/>
+              </w:rPr>
+              <w:t xml:space="preserve">berry</w:t>
+            </w:r>
+            <w:r>
+              <w:t xml:space="preserve">) y son los más frecuentes. Los </w:t>
+            </w:r>
+            <w:r>
+              <w:rPr>
+                <w:b/>
+                <w:bCs/>
+              </w:rPr>
+              <w:t xml:space="preserve">fusiform</w:t>
+            </w:r>
+            <w:r>
+              <w:t xml:space="preserve"> dilatan toda la arteria. Los </w:t>
+            </w:r>
+            <w:r>
+              <w:rPr>
+                <w:b/>
+                <w:bCs/>
+              </w:rPr>
+              <w:t xml:space="preserve">dissecting</w:t>
+            </w:r>
+            <w:r>
+              <w:t xml:space="preserve"> empiezan con un desgarro en la pared. El tamaño es muy importante: como podéis ver, cuanto más grande es el aneurisma, mayor es el riesgo. En el estudio </w:t>
+            </w:r>
+            <w:r>
+              <w:rPr>
+                <w:b/>
+                <w:bCs/>
+              </w:rPr>
+              <w:t xml:space="preserve">ISUIA</w:t>
+            </w:r>
+            <w:r>
+              <w:t xml:space="preserve">, los aneurismas pequeños casi nunca se rompieron en 5 años, pero los gigantes se rompieron en el 40% de los casos.</w:t>
             </w:r>
           </w:p>
         </w:tc>
@@ -8227,14 +8458,57 @@
               <w:spacing w:after="60"/>
             </w:pPr>
             <w:r>
-              <w:rPr>
-                <w:b/>
-                <w:bCs/>
-              </w:rPr>
-              <w:t xml:space="preserve">[A] </w:t>
-            </w:r>
-            <w:r>
-              <w:t xml:space="preserve">A brain aneurysm is a weak area in the wall of an artery. The wall bulges and fills with blood, like a small balloon. Aneurysms usually appear where arteries divide.</w:t>
+              <w:t xml:space="preserve">Aneurysms are classified by shape and by size. </w:t>
+            </w:r>
+            <w:r>
+              <w:rPr>
+                <w:b/>
+                <w:bCs/>
+              </w:rPr>
+              <w:t xml:space="preserve">Saccular</w:t>
+            </w:r>
+            <w:r>
+              <w:t xml:space="preserve"> aneurysms look like a </w:t>
+            </w:r>
+            <w:r>
+              <w:rPr>
+                <w:b/>
+                <w:bCs/>
+              </w:rPr>
+              <w:t xml:space="preserve">berry</w:t>
+            </w:r>
+            <w:r>
+              <w:t xml:space="preserve">, and they are the most common. </w:t>
+            </w:r>
+            <w:r>
+              <w:rPr>
+                <w:b/>
+                <w:bCs/>
+              </w:rPr>
+              <w:t xml:space="preserve">Fusiform</w:t>
+            </w:r>
+            <w:r>
+              <w:t xml:space="preserve"> aneurysms dilate the whole artery. </w:t>
+            </w:r>
+            <w:r>
+              <w:rPr>
+                <w:b/>
+                <w:bCs/>
+              </w:rPr>
+              <w:t xml:space="preserve">Dissecting</w:t>
+            </w:r>
+            <w:r>
+              <w:t xml:space="preserve"> aneurysms start with a tear in the wall. Size is very important: as you can see, the bigger the aneurysm, the higher the risk. In the </w:t>
+            </w:r>
+            <w:r>
+              <w:rPr>
+                <w:b/>
+                <w:bCs/>
+              </w:rPr>
+              <w:t xml:space="preserve">ISUIA</w:t>
+            </w:r>
+            <w:r>
+              <w:t xml:space="preserve"> study, small aneurysms almost never broke in 5 years, but giant ones broke in 40% of cases.</w:t>
             </w:r>
           </w:p>
         </w:tc>
@@ -8245,151 +8519,6 @@
         </w:trPr>
         <w:tc>
           <w:tcPr>
-            <w:tcW w:type="dxa" w:w="4819"/>
-            <w:tcBorders>
-              <w:top w:val="single" w:color="C9D3DD" w:sz="4"/>
-              <w:left w:val="single" w:color="C9D3DD" w:sz="4"/>
-              <w:bottom w:val="single" w:color="C9D3DD" w:sz="4"/>
-              <w:right w:val="single" w:color="C9D3DD" w:sz="4"/>
-            </w:tcBorders>
-            <w:shd w:fill="FBEDE7" w:color="auto" w:val="clear"/>
-            <w:tcMar>
-              <w:top w:type="dxa" w:w="100"/>
-              <w:left w:type="dxa" w:w="140"/>
-              <w:bottom w:type="dxa" w:w="100"/>
-              <w:right w:type="dxa" w:w="140"/>
-            </w:tcMar>
-          </w:tcPr>
-          <w:p>
-            <w:pPr>
-              <w:keepNext/>
-              <w:keepLines/>
-              <w:spacing w:after="60"/>
-            </w:pPr>
-            <w:r>
-              <w:rPr>
-                <w:b/>
-                <w:bCs/>
-              </w:rPr>
-              <w:t xml:space="preserve">[B] </w:t>
-            </w:r>
-            <w:r>
-              <w:t xml:space="preserve">Cuando la pared se rompe, la sangre pasa al espacio subaracnoideo, entre la aracnoides y la piamadre. Esto se llama </w:t>
-            </w:r>
-            <w:r>
-              <w:rPr>
-                <w:b/>
-                <w:bCs/>
-              </w:rPr>
-              <w:t xml:space="preserve">subarachnoid hemorrhage</w:t>
-            </w:r>
-            <w:r>
-              <w:t xml:space="preserve">. En este </w:t>
-            </w:r>
-            <w:r>
-              <w:rPr>
-                <w:b/>
-                <w:bCs/>
-              </w:rPr>
-              <w:t xml:space="preserve">CT</w:t>
-            </w:r>
-            <w:r>
-              <w:t xml:space="preserve">, la flecha señala la sangre. La causa principal de este sangrado es un aneurisma roto.</w:t>
-            </w:r>
-          </w:p>
-        </w:tc>
-        <w:tc>
-          <w:tcPr>
-            <w:tcW w:type="dxa" w:w="4819"/>
-            <w:tcBorders>
-              <w:top w:val="single" w:color="C9D3DD" w:sz="4"/>
-              <w:left w:val="single" w:color="C9D3DD" w:sz="4"/>
-              <w:bottom w:val="single" w:color="C9D3DD" w:sz="4"/>
-              <w:right w:val="single" w:color="C9D3DD" w:sz="4"/>
-            </w:tcBorders>
-            <w:shd w:fill="FBEDE7" w:color="auto" w:val="clear"/>
-            <w:tcMar>
-              <w:top w:type="dxa" w:w="100"/>
-              <w:left w:type="dxa" w:w="140"/>
-              <w:bottom w:type="dxa" w:w="100"/>
-              <w:right w:type="dxa" w:w="140"/>
-            </w:tcMar>
-          </w:tcPr>
-          <w:p>
-            <w:pPr>
-              <w:keepNext/>
-              <w:keepLines/>
-              <w:spacing w:after="60"/>
-            </w:pPr>
-            <w:r>
-              <w:rPr>
-                <w:b/>
-                <w:bCs/>
-              </w:rPr>
-              <w:t xml:space="preserve">[B] </w:t>
-            </w:r>
-            <w:r>
-              <w:t xml:space="preserve">When the wall breaks, blood goes into the </w:t>
-            </w:r>
-            <w:r>
-              <w:rPr>
-                <w:b/>
-                <w:bCs/>
-              </w:rPr>
-              <w:t xml:space="preserve">subarachnoid</w:t>
-            </w:r>
-            <w:r>
-              <w:t xml:space="preserve"> space, between the </w:t>
-            </w:r>
-            <w:r>
-              <w:rPr>
-                <w:b/>
-                <w:bCs/>
-              </w:rPr>
-              <w:t xml:space="preserve">arachnoid</w:t>
-            </w:r>
-            <w:r>
-              <w:t xml:space="preserve"> and the </w:t>
-            </w:r>
-            <w:r>
-              <w:rPr>
-                <w:b/>
-                <w:bCs/>
-              </w:rPr>
-              <w:t xml:space="preserve">pia mater</w:t>
-            </w:r>
-            <w:r>
-              <w:t xml:space="preserve">. This is called </w:t>
-            </w:r>
-            <w:r>
-              <w:rPr>
-                <w:b/>
-                <w:bCs/>
-              </w:rPr>
-              <w:t xml:space="preserve">subarachnoid hemorrhage</w:t>
-            </w:r>
-            <w:r>
-              <w:t xml:space="preserve">. In this </w:t>
-            </w:r>
-            <w:r>
-              <w:rPr>
-                <w:b/>
-                <w:bCs/>
-              </w:rPr>
-              <w:t xml:space="preserve">CT</w:t>
-            </w:r>
-            <w:r>
-              <w:t xml:space="preserve">, the arrow shows the blood. The main cause of this bleeding is a ruptured aneurysm.</w:t>
-            </w:r>
-          </w:p>
-        </w:tc>
-      </w:tr>
-      <w:tr>
-        <w:trPr>
-          <w:cantSplit/>
-        </w:trPr>
-        <w:tc>
-          <w:tcPr>
             <w:tcW w:type="dxa" w:w="9638"/>
             <w:gridSpan w:val="2"/>
             <w:tcBorders>
@@ -8420,7 +8549,7 @@
               <w:t xml:space="preserve">Pronunciación:</w:t>
             </w:r>
             <w:r>
-              <w:t xml:space="preserve"> subarachnoid /sub-uh-RAK-noid/ · hemorrhage /HEM-uh-rij/ · bulges /BUL-jiz/ · balloon /buh-LOON/</w:t>
+              <w:t xml:space="preserve"> saccular /SAK-yuh-ler/ · fusiform /FYOO-zih-form/ · tear /tair/ (desgarro) · giant /JY-unt/</w:t>
             </w:r>
           </w:p>
           <w:p>
@@ -8437,7 +8566,7 @@
               <w:t xml:space="preserve">Relevo:</w:t>
             </w:r>
             <w:r>
-              <w:t xml:space="preserve"> A → B: A termina con "…where arteries divide." y B entra con "And when the wall breaks…"</w:t>
+              <w:t xml:space="preserve"> Final de A → "Now my colleague will explain how doctors grade a ruptured aneurysm."</w:t>
             </w:r>
           </w:p>
         </w:tc>
@@ -8501,7 +8630,7 @@
                 <w:sz w:val="26"/>
                 <w:szCs w:val="26"/>
               </w:rPr>
-              <w:t xml:space="preserve">8 · Types · Shape &amp; size</w:t>
+              <w:t xml:space="preserve">8 · Types · How severe is the bleed?</w:t>
             </w:r>
             <w:r>
               <w:rPr>
@@ -8509,7 +8638,7 @@
                 <w:sz w:val="22"/>
                 <w:szCs w:val="22"/>
               </w:rPr>
-              <w:t xml:space="preserve">     Habla: A  ·  ≈ 45 s</w:t>
+              <w:t xml:space="preserve">     Habla: B  ·  ≈ 30 s</w:t>
             </w:r>
           </w:p>
         </w:tc>
@@ -8604,7 +8733,7 @@
               <w:bottom w:val="single" w:color="C9D3DD" w:sz="4"/>
               <w:right w:val="single" w:color="C9D3DD" w:sz="4"/>
             </w:tcBorders>
-            <w:shd w:fill="E6F0F8" w:color="auto" w:val="clear"/>
+            <w:shd w:fill="FBEDE7" w:color="auto" w:val="clear"/>
             <w:tcMar>
               <w:top w:type="dxa" w:w="100"/>
               <w:left w:type="dxa" w:w="140"/>
@@ -8619,57 +8748,37 @@
               <w:spacing w:after="60"/>
             </w:pPr>
             <w:r>
-              <w:t xml:space="preserve">Los aneurismas se clasifican por forma y por tamaño. Los </w:t>
-            </w:r>
-            <w:r>
-              <w:rPr>
-                <w:b/>
-                <w:bCs/>
-              </w:rPr>
-              <w:t xml:space="preserve">saccular</w:t>
-            </w:r>
-            <w:r>
-              <w:t xml:space="preserve"> parecen una baya (</w:t>
-            </w:r>
-            <w:r>
-              <w:rPr>
-                <w:b/>
-                <w:bCs/>
-              </w:rPr>
-              <w:t xml:space="preserve">berry</w:t>
-            </w:r>
-            <w:r>
-              <w:t xml:space="preserve">) y son los más frecuentes. Los </w:t>
-            </w:r>
-            <w:r>
-              <w:rPr>
-                <w:b/>
-                <w:bCs/>
-              </w:rPr>
-              <w:t xml:space="preserve">fusiform</w:t>
-            </w:r>
-            <w:r>
-              <w:t xml:space="preserve"> dilatan toda la arteria. Los </w:t>
-            </w:r>
-            <w:r>
-              <w:rPr>
-                <w:b/>
-                <w:bCs/>
-              </w:rPr>
-              <w:t xml:space="preserve">dissecting</w:t>
-            </w:r>
-            <w:r>
-              <w:t xml:space="preserve"> empiezan con un desgarro en la pared. El tamaño es muy importante: como podéis ver, cuanto más grande es el aneurisma, mayor es el riesgo. En el estudio </w:t>
-            </w:r>
-            <w:r>
-              <w:rPr>
-                <w:b/>
-                <w:bCs/>
-              </w:rPr>
-              <w:t xml:space="preserve">ISUIA</w:t>
-            </w:r>
-            <w:r>
-              <w:t xml:space="preserve">, los aneurismas pequeños casi nunca se rompieron en 5 años, pero los gigantes se rompieron en el 40% de los casos.</w:t>
+              <w:t xml:space="preserve">Gracias. Cuando el aneurisma se rompe, los médicos le ponen al paciente un grado. Algunas escalas miran al paciente. Otra escala mira el </w:t>
+            </w:r>
+            <w:r>
+              <w:rPr>
+                <w:b/>
+                <w:bCs/>
+              </w:rPr>
+              <w:t xml:space="preserve">CT scan</w:t>
+            </w:r>
+            <w:r>
+              <w:t xml:space="preserve">: más sangre significa más riesgo de </w:t>
+            </w:r>
+            <w:r>
+              <w:rPr>
+                <w:b/>
+                <w:bCs/>
+              </w:rPr>
+              <w:t xml:space="preserve">vasospasm</w:t>
+            </w:r>
+            <w:r>
+              <w:t xml:space="preserve">. Los grados 4 y 5 son "</w:t>
+            </w:r>
+            <w:r>
+              <w:rPr>
+                <w:b/>
+                <w:bCs/>
+              </w:rPr>
+              <w:t xml:space="preserve">poor grade</w:t>
+            </w:r>
+            <w:r>
+              <w:t xml:space="preserve">". Sin embargo, alrededor del 40% de estos pacientes todavía tiene un buen resultado con tratamiento.</w:t>
             </w:r>
           </w:p>
         </w:tc>
@@ -8682,7 +8791,7 @@
               <w:bottom w:val="single" w:color="C9D3DD" w:sz="4"/>
               <w:right w:val="single" w:color="C9D3DD" w:sz="4"/>
             </w:tcBorders>
-            <w:shd w:fill="E6F0F8" w:color="auto" w:val="clear"/>
+            <w:shd w:fill="FBEDE7" w:color="auto" w:val="clear"/>
             <w:tcMar>
               <w:top w:type="dxa" w:w="100"/>
               <w:left w:type="dxa" w:w="140"/>
@@ -8697,57 +8806,37 @@
               <w:spacing w:after="60"/>
             </w:pPr>
             <w:r>
-              <w:t xml:space="preserve">Aneurysms are classified by shape and by size. </w:t>
-            </w:r>
-            <w:r>
-              <w:rPr>
-                <w:b/>
-                <w:bCs/>
-              </w:rPr>
-              <w:t xml:space="preserve">Saccular</w:t>
-            </w:r>
-            <w:r>
-              <w:t xml:space="preserve"> aneurysms look like a </w:t>
-            </w:r>
-            <w:r>
-              <w:rPr>
-                <w:b/>
-                <w:bCs/>
-              </w:rPr>
-              <w:t xml:space="preserve">berry</w:t>
-            </w:r>
-            <w:r>
-              <w:t xml:space="preserve">, and they are the most common. </w:t>
-            </w:r>
-            <w:r>
-              <w:rPr>
-                <w:b/>
-                <w:bCs/>
-              </w:rPr>
-              <w:t xml:space="preserve">Fusiform</w:t>
-            </w:r>
-            <w:r>
-              <w:t xml:space="preserve"> aneurysms dilate the whole artery. </w:t>
-            </w:r>
-            <w:r>
-              <w:rPr>
-                <w:b/>
-                <w:bCs/>
-              </w:rPr>
-              <w:t xml:space="preserve">Dissecting</w:t>
-            </w:r>
-            <w:r>
-              <w:t xml:space="preserve"> aneurysms start with a tear in the wall. Size is very important: as you can see, the bigger the aneurysm, the higher the risk. In the </w:t>
-            </w:r>
-            <w:r>
-              <w:rPr>
-                <w:b/>
-                <w:bCs/>
-              </w:rPr>
-              <w:t xml:space="preserve">ISUIA</w:t>
-            </w:r>
-            <w:r>
-              <w:t xml:space="preserve"> study, small aneurysms almost never broke in 5 years, but giant ones broke in 40% of cases.</w:t>
+              <w:t xml:space="preserve">Thank you. When the aneurysm breaks, doctors give the patient a grade. Some scales look at the patient. Another scale looks at the </w:t>
+            </w:r>
+            <w:r>
+              <w:rPr>
+                <w:b/>
+                <w:bCs/>
+              </w:rPr>
+              <w:t xml:space="preserve">CT scan</w:t>
+            </w:r>
+            <w:r>
+              <w:t xml:space="preserve">: more blood means more risk of </w:t>
+            </w:r>
+            <w:r>
+              <w:rPr>
+                <w:b/>
+                <w:bCs/>
+              </w:rPr>
+              <w:t xml:space="preserve">vasospasm</w:t>
+            </w:r>
+            <w:r>
+              <w:t xml:space="preserve">. Grades 4 and 5 are "</w:t>
+            </w:r>
+            <w:r>
+              <w:rPr>
+                <w:b/>
+                <w:bCs/>
+              </w:rPr>
+              <w:t xml:space="preserve">poor grade</w:t>
+            </w:r>
+            <w:r>
+              <w:t xml:space="preserve">". However, about 40% of these patients still have a good outcome with treatment.</w:t>
             </w:r>
           </w:p>
         </w:tc>
@@ -8788,7 +8877,7 @@
               <w:t xml:space="preserve">Pronunciación:</w:t>
             </w:r>
             <w:r>
-              <w:t xml:space="preserve"> saccular /SAK-yuh-ler/ · fusiform /FYOO-zih-form/ · tear /tair/ (desgarro) · giant /JY-unt/</w:t>
+              <w:t xml:space="preserve"> severe /suh-VEER/ · vasospasm /VAY-zoh-spaz-um/ · grade /grayd/ · treatment /TREET-ment/</w:t>
             </w:r>
           </w:p>
           <w:p>
@@ -8805,7 +8894,7 @@
               <w:t xml:space="preserve">Relevo:</w:t>
             </w:r>
             <w:r>
-              <w:t xml:space="preserve"> Final de A → "Now my colleague will explain how doctors grade a ruptured aneurysm."</w:t>
+              <w:t xml:space="preserve"> Final de B → "Now my colleague will explain the causes."</w:t>
             </w:r>
           </w:p>
         </w:tc>
@@ -8869,7 +8958,7 @@
                 <w:sz w:val="26"/>
                 <w:szCs w:val="26"/>
               </w:rPr>
-              <w:t xml:space="preserve">9 · Types · Grading scales</w:t>
+              <w:t xml:space="preserve">9 · Causes · Risk factors</w:t>
             </w:r>
             <w:r>
               <w:rPr>
@@ -8877,7 +8966,7 @@
                 <w:sz w:val="22"/>
                 <w:szCs w:val="22"/>
               </w:rPr>
-              <w:t xml:space="preserve">     Habla: B  ·  ≈ 40 s</w:t>
+              <w:t xml:space="preserve">     Habla: A  ·  ≈ 35 s</w:t>
             </w:r>
           </w:p>
         </w:tc>
@@ -8972,7 +9061,7 @@
               <w:bottom w:val="single" w:color="C9D3DD" w:sz="4"/>
               <w:right w:val="single" w:color="C9D3DD" w:sz="4"/>
             </w:tcBorders>
-            <w:shd w:fill="FBEDE7" w:color="auto" w:val="clear"/>
+            <w:shd w:fill="E6F0F8" w:color="auto" w:val="clear"/>
             <w:tcMar>
               <w:top w:type="dxa" w:w="100"/>
               <w:left w:type="dxa" w:w="140"/>
@@ -8987,77 +9076,17 @@
               <w:spacing w:after="60"/>
             </w:pPr>
             <w:r>
-              <w:t xml:space="preserve">Gracias. Cuando el aneurisma se rompe, los médicos usan escalas de gravedad. Es decir, le dan al paciente un número de leve a grave. </w:t>
-            </w:r>
-            <w:r>
-              <w:rPr>
-                <w:b/>
-                <w:bCs/>
-              </w:rPr>
-              <w:t xml:space="preserve">Hunt and Hess</w:t>
-            </w:r>
-            <w:r>
-              <w:t xml:space="preserve"> mira el estado clínico. </w:t>
-            </w:r>
-            <w:r>
-              <w:rPr>
-                <w:b/>
-                <w:bCs/>
-              </w:rPr>
-              <w:t xml:space="preserve">WFNS</w:t>
-            </w:r>
-            <w:r>
-              <w:t xml:space="preserve"> usa la </w:t>
-            </w:r>
-            <w:r>
-              <w:rPr>
-                <w:b/>
-                <w:bCs/>
-              </w:rPr>
-              <w:t xml:space="preserve">Glasgow Coma Scale</w:t>
-            </w:r>
-            <w:r>
-              <w:t xml:space="preserve">. La </w:t>
-            </w:r>
-            <w:r>
-              <w:rPr>
-                <w:b/>
-                <w:bCs/>
-              </w:rPr>
-              <w:t xml:space="preserve">modified Fisher scale</w:t>
-            </w:r>
-            <w:r>
-              <w:t xml:space="preserve"> mira la sangre en el </w:t>
-            </w:r>
-            <w:r>
-              <w:rPr>
-                <w:b/>
-                <w:bCs/>
-              </w:rPr>
-              <w:t xml:space="preserve">CT</w:t>
-            </w:r>
-            <w:r>
-              <w:t xml:space="preserve"> y predice el </w:t>
-            </w:r>
-            <w:r>
-              <w:rPr>
-                <w:b/>
-                <w:bCs/>
-              </w:rPr>
-              <w:t xml:space="preserve">vasospasm</w:t>
-            </w:r>
-            <w:r>
-              <w:t xml:space="preserve">. Los grados 4 y 5 son "</w:t>
-            </w:r>
-            <w:r>
-              <w:rPr>
-                <w:b/>
-                <w:bCs/>
-              </w:rPr>
-              <w:t xml:space="preserve">poor grade</w:t>
-            </w:r>
-            <w:r>
-              <w:t xml:space="preserve">". Sin embargo, alrededor del 40% de estos pacientes todavía tiene un buen resultado si se les trata.</w:t>
+              <w:t xml:space="preserve">Hay dos grupos de factores de riesgo. Primero, los modificables: en familias con aneurismas, los fumadores tenían casi tres veces más aneurismas, y la tensión alta también es importante. Segundo, los no modificables. Los antecedentes familiares multiplican el riesgo por 3,4. La </w:t>
+            </w:r>
+            <w:r>
+              <w:rPr>
+                <w:b/>
+                <w:bCs/>
+              </w:rPr>
+              <w:t xml:space="preserve">polycystic kidney disease</w:t>
+            </w:r>
+            <w:r>
+              <w:t xml:space="preserve"> lo multiplica por casi 7. Por último, las mujeres tienen más aneurismas que los hombres.</w:t>
             </w:r>
           </w:p>
         </w:tc>
@@ -9070,7 +9099,7 @@
               <w:bottom w:val="single" w:color="C9D3DD" w:sz="4"/>
               <w:right w:val="single" w:color="C9D3DD" w:sz="4"/>
             </w:tcBorders>
-            <w:shd w:fill="FBEDE7" w:color="auto" w:val="clear"/>
+            <w:shd w:fill="E6F0F8" w:color="auto" w:val="clear"/>
             <w:tcMar>
               <w:top w:type="dxa" w:w="100"/>
               <w:left w:type="dxa" w:w="140"/>
@@ -9085,77 +9114,17 @@
               <w:spacing w:after="60"/>
             </w:pPr>
             <w:r>
-              <w:t xml:space="preserve">Thank you. When the aneurysm breaks, doctors use grading scales. In other words, they give the patient a number from mild to severe. </w:t>
-            </w:r>
-            <w:r>
-              <w:rPr>
-                <w:b/>
-                <w:bCs/>
-              </w:rPr>
-              <w:t xml:space="preserve">Hunt and Hess</w:t>
-            </w:r>
-            <w:r>
-              <w:t xml:space="preserve"> looks at the clinical status. </w:t>
-            </w:r>
-            <w:r>
-              <w:rPr>
-                <w:b/>
-                <w:bCs/>
-              </w:rPr>
-              <w:t xml:space="preserve">WFNS</w:t>
-            </w:r>
-            <w:r>
-              <w:t xml:space="preserve"> uses the </w:t>
-            </w:r>
-            <w:r>
-              <w:rPr>
-                <w:b/>
-                <w:bCs/>
-              </w:rPr>
-              <w:t xml:space="preserve">Glasgow Coma Scale</w:t>
-            </w:r>
-            <w:r>
-              <w:t xml:space="preserve">. The </w:t>
-            </w:r>
-            <w:r>
-              <w:rPr>
-                <w:b/>
-                <w:bCs/>
-              </w:rPr>
-              <w:t xml:space="preserve">modified Fisher scale</w:t>
-            </w:r>
-            <w:r>
-              <w:t xml:space="preserve"> looks at the blood on the </w:t>
-            </w:r>
-            <w:r>
-              <w:rPr>
-                <w:b/>
-                <w:bCs/>
-              </w:rPr>
-              <w:t xml:space="preserve">CT</w:t>
-            </w:r>
-            <w:r>
-              <w:t xml:space="preserve"> and predicts </w:t>
-            </w:r>
-            <w:r>
-              <w:rPr>
-                <w:b/>
-                <w:bCs/>
-              </w:rPr>
-              <w:t xml:space="preserve">vasospasm</w:t>
-            </w:r>
-            <w:r>
-              <w:t xml:space="preserve">. Grades 4 and 5 are "</w:t>
-            </w:r>
-            <w:r>
-              <w:rPr>
-                <w:b/>
-                <w:bCs/>
-              </w:rPr>
-              <w:t xml:space="preserve">poor grade</w:t>
-            </w:r>
-            <w:r>
-              <w:t xml:space="preserve">". However, about 40% of these patients still have a good outcome if they are treated.</w:t>
+              <w:t xml:space="preserve">There are two groups of risk factors. First, modifiable factors: in families with aneurysms, smokers had almost three times more aneurysms, and high blood pressure is also important. Second, non-modifiable factors. A family history multiplies the risk by 3.4. </w:t>
+            </w:r>
+            <w:r>
+              <w:rPr>
+                <w:b/>
+                <w:bCs/>
+              </w:rPr>
+              <w:t xml:space="preserve">Polycystic kidney disease</w:t>
+            </w:r>
+            <w:r>
+              <w:t xml:space="preserve"> multiplies it by almost 7. Finally, women have more aneurysms than men.</w:t>
             </w:r>
           </w:p>
         </w:tc>
@@ -9196,24 +9165,7 @@
               <w:t xml:space="preserve">Pronunciación:</w:t>
             </w:r>
             <w:r>
-              <w:t xml:space="preserve"> vasospasm /VAY-zoh-spaz-um/ · severe /suh-VEER/ · Glasgow /GLAZ-goh/ · treated /TREE-tid/</w:t>
-            </w:r>
-          </w:p>
-          <w:p>
-            <w:pPr>
-              <w:keepNext w:val="false"/>
-              <w:keepLines/>
-              <w:spacing w:after="60"/>
-            </w:pPr>
-            <w:r>
-              <w:rPr>
-                <w:b/>
-                <w:bCs/>
-              </w:rPr>
-              <w:t xml:space="preserve">Relevo:</w:t>
-            </w:r>
-            <w:r>
-              <w:t xml:space="preserve"> Final de B → "Now my colleague will explain the causes."</w:t>
+              <w:t xml:space="preserve"> polycystic /pol-ee-SIS-tik/ · hypertension /hy-per-TEN-shun/ · 3.4 = "three point four" (en inglés, punto, no coma)</w:t>
             </w:r>
           </w:p>
         </w:tc>
@@ -9277,7 +9229,7 @@
                 <w:sz w:val="26"/>
                 <w:szCs w:val="26"/>
               </w:rPr>
-              <w:t xml:space="preserve">10 · Causes · Risk factors</w:t>
+              <w:t xml:space="preserve">10 · Signs &amp; symptoms</w:t>
             </w:r>
             <w:r>
               <w:rPr>
@@ -9285,7 +9237,7 @@
                 <w:sz w:val="22"/>
                 <w:szCs w:val="22"/>
               </w:rPr>
-              <w:t xml:space="preserve">     Habla: A  ·  ≈ 35 s</w:t>
+              <w:t xml:space="preserve">     Habla: A + B  ·  ≈ 50 s</w:t>
             </w:r>
           </w:p>
         </w:tc>
@@ -9395,17 +9347,24 @@
               <w:spacing w:after="60"/>
             </w:pPr>
             <w:r>
-              <w:t xml:space="preserve">Hay dos grupos de factores de riesgo. Primero, los modificables: en familias con aneurismas, los fumadores tenían casi tres veces más aneurismas, y la tensión alta también es importante. Segundo, los no modificables. Los antecedentes familiares multiplican el riesgo por 3,4. La </w:t>
-            </w:r>
-            <w:r>
-              <w:rPr>
-                <w:b/>
-                <w:bCs/>
-              </w:rPr>
-              <w:t xml:space="preserve">polycystic kidney disease</w:t>
-            </w:r>
-            <w:r>
-              <w:t xml:space="preserve"> lo multiplica por casi 7. Por último, las mujeres tienen más aneurismas que los hombres.</w:t>
+              <w:rPr>
+                <w:b/>
+                <w:bCs/>
+              </w:rPr>
+              <w:t xml:space="preserve">[A] </w:t>
+            </w:r>
+            <w:r>
+              <w:t xml:space="preserve">Un aneurisma no roto suele ser silencioso. La mayoría de la gente no sabe que lo tiene. Sin embargo, un aneurisma grande puede comprimir un nervio, como en esta imagen. Entonces el paciente puede tener dolor de cabeza, cambios en la visión o una parálisis de un nervio (</w:t>
+            </w:r>
+            <w:r>
+              <w:rPr>
+                <w:b/>
+                <w:bCs/>
+              </w:rPr>
+              <w:t xml:space="preserve">nerve palsy</w:t>
+            </w:r>
+            <w:r>
+              <w:t xml:space="preserve">).</w:t>
             </w:r>
           </w:p>
         </w:tc>
@@ -9433,17 +9392,24 @@
               <w:spacing w:after="60"/>
             </w:pPr>
             <w:r>
-              <w:t xml:space="preserve">There are two groups of risk factors. First, modifiable factors: in families with aneurysms, smokers had almost three times more aneurysms, and high blood pressure is also important. Second, non-modifiable factors. A family history multiplies the risk by 3.4. </w:t>
-            </w:r>
-            <w:r>
-              <w:rPr>
-                <w:b/>
-                <w:bCs/>
-              </w:rPr>
-              <w:t xml:space="preserve">Polycystic kidney disease</w:t>
-            </w:r>
-            <w:r>
-              <w:t xml:space="preserve"> multiplies it by almost 7. Finally, women have more aneurysms than men.</w:t>
+              <w:rPr>
+                <w:b/>
+                <w:bCs/>
+              </w:rPr>
+              <w:t xml:space="preserve">[A] </w:t>
+            </w:r>
+            <w:r>
+              <w:t xml:space="preserve">An unruptured aneurysm is often silent. Most people do not know they have one. However, a big aneurysm can press on a nerve, like in this picture. Then the patient may have a headache, vision changes or a </w:t>
+            </w:r>
+            <w:r>
+              <w:rPr>
+                <w:b/>
+                <w:bCs/>
+              </w:rPr>
+              <w:t xml:space="preserve">nerve palsy</w:t>
+            </w:r>
+            <w:r>
+              <w:t xml:space="preserve">.</w:t>
             </w:r>
           </w:p>
         </w:tc>
@@ -9454,6 +9420,101 @@
         </w:trPr>
         <w:tc>
           <w:tcPr>
+            <w:tcW w:type="dxa" w:w="4819"/>
+            <w:tcBorders>
+              <w:top w:val="single" w:color="C9D3DD" w:sz="4"/>
+              <w:left w:val="single" w:color="C9D3DD" w:sz="4"/>
+              <w:bottom w:val="single" w:color="C9D3DD" w:sz="4"/>
+              <w:right w:val="single" w:color="C9D3DD" w:sz="4"/>
+            </w:tcBorders>
+            <w:shd w:fill="FBEDE7" w:color="auto" w:val="clear"/>
+            <w:tcMar>
+              <w:top w:type="dxa" w:w="100"/>
+              <w:left w:type="dxa" w:w="140"/>
+              <w:bottom w:type="dxa" w:w="100"/>
+              <w:right w:type="dxa" w:w="140"/>
+            </w:tcMar>
+          </w:tcPr>
+          <w:p>
+            <w:pPr>
+              <w:keepNext/>
+              <w:keepLines/>
+              <w:spacing w:after="60"/>
+            </w:pPr>
+            <w:r>
+              <w:rPr>
+                <w:b/>
+                <w:bCs/>
+              </w:rPr>
+              <w:t xml:space="preserve">[B] </w:t>
+            </w:r>
+            <w:r>
+              <w:t xml:space="preserve">En cambio, un aneurisma roto es muy "ruidoso". El paciente siente "el peor dolor de cabeza de mi vida", en segundos (</w:t>
+            </w:r>
+            <w:r>
+              <w:rPr>
+                <w:b/>
+                <w:bCs/>
+              </w:rPr>
+              <w:t xml:space="preserve">thunderclap headache</w:t>
+            </w:r>
+            <w:r>
+              <w:t xml:space="preserve">). Hay vómitos, la luz molesta a los ojos (</w:t>
+            </w:r>
+            <w:r>
+              <w:rPr>
+                <w:b/>
+                <w:bCs/>
+              </w:rPr>
+              <w:t xml:space="preserve">photophobia</w:t>
+            </w:r>
+            <w:r>
+              <w:t xml:space="preserve">) y el cuello está rígido. Hasta en el 43% de los casos hay antes un dolor de cabeza de aviso.</w:t>
+            </w:r>
+          </w:p>
+        </w:tc>
+        <w:tc>
+          <w:tcPr>
+            <w:tcW w:type="dxa" w:w="4819"/>
+            <w:tcBorders>
+              <w:top w:val="single" w:color="C9D3DD" w:sz="4"/>
+              <w:left w:val="single" w:color="C9D3DD" w:sz="4"/>
+              <w:bottom w:val="single" w:color="C9D3DD" w:sz="4"/>
+              <w:right w:val="single" w:color="C9D3DD" w:sz="4"/>
+            </w:tcBorders>
+            <w:shd w:fill="FBEDE7" w:color="auto" w:val="clear"/>
+            <w:tcMar>
+              <w:top w:type="dxa" w:w="100"/>
+              <w:left w:type="dxa" w:w="140"/>
+              <w:bottom w:type="dxa" w:w="100"/>
+              <w:right w:type="dxa" w:w="140"/>
+            </w:tcMar>
+          </w:tcPr>
+          <w:p>
+            <w:pPr>
+              <w:keepNext/>
+              <w:keepLines/>
+              <w:spacing w:after="60"/>
+            </w:pPr>
+            <w:r>
+              <w:rPr>
+                <w:b/>
+                <w:bCs/>
+              </w:rPr>
+              <w:t xml:space="preserve">[B] </w:t>
+            </w:r>
+            <w:r>
+              <w:t xml:space="preserve">In contrast, a ruptured aneurysm is very loud. The patient feels "the worst headache of my life", in seconds. There is vomiting, light hurts the eyes and the neck is stiff. In up to 43% of cases, there is a warning headache before.</w:t>
+            </w:r>
+          </w:p>
+        </w:tc>
+      </w:tr>
+      <w:tr>
+        <w:trPr>
+          <w:cantSplit/>
+        </w:trPr>
+        <w:tc>
+          <w:tcPr>
             <w:tcW w:type="dxa" w:w="9638"/>
             <w:gridSpan w:val="2"/>
             <w:tcBorders>
@@ -9484,7 +9545,24 @@
               <w:t xml:space="preserve">Pronunciación:</w:t>
             </w:r>
             <w:r>
-              <w:t xml:space="preserve"> polycystic /pol-ee-SIS-tik/ · hypertension /hy-per-TEN-shun/ · 3.4 = "three point four" (en inglés, punto, no coma)</w:t>
+              <w:t xml:space="preserve"> thunderclap /THUN-der-klap/ · photophobia /foh-toh-FOH-bee-uh/ · palsy /PAWL-zee/ · vomiting /VOM-ih-ting/</w:t>
+            </w:r>
+          </w:p>
+          <w:p>
+            <w:pPr>
+              <w:keepNext w:val="false"/>
+              <w:keepLines/>
+              <w:spacing w:after="60"/>
+            </w:pPr>
+            <w:r>
+              <w:rPr>
+                <w:b/>
+                <w:bCs/>
+              </w:rPr>
+              <w:t xml:space="preserve">Relevo:</w:t>
+            </w:r>
+            <w:r>
+              <w:t xml:space="preserve"> A → B: "…or a nerve palsy." → B: "In contrast, …"</w:t>
             </w:r>
           </w:p>
         </w:tc>
@@ -9548,7 +9626,7 @@
                 <w:sz w:val="26"/>
                 <w:szCs w:val="26"/>
               </w:rPr>
-              <w:t xml:space="preserve">11 · Signs &amp; symptoms</w:t>
+              <w:t xml:space="preserve">11 · Diagnosis</w:t>
             </w:r>
             <w:r>
               <w:rPr>
@@ -9673,17 +9751,37 @@
               <w:t xml:space="preserve">[A] </w:t>
             </w:r>
             <w:r>
-              <w:t xml:space="preserve">Un aneurisma no roto suele ser silencioso. La mayoría de la gente no sabe que lo tiene. Sin embargo, un aneurisma grande puede comprimir un nervio, como en esta imagen. Entonces el paciente puede tener dolor de cabeza, cambios en la visión o una parálisis de un nervio (</w:t>
-            </w:r>
-            <w:r>
-              <w:rPr>
-                <w:b/>
-                <w:bCs/>
-              </w:rPr>
-              <w:t xml:space="preserve">nerve palsy</w:t>
-            </w:r>
-            <w:r>
-              <w:t xml:space="preserve">).</w:t>
+              <w:t xml:space="preserve">La mayoría de los aneurismas no rotos se encuentran por casualidad, en una prueba hecha por otro motivo. Los médicos usan </w:t>
+            </w:r>
+            <w:r>
+              <w:rPr>
+                <w:b/>
+                <w:bCs/>
+              </w:rPr>
+              <w:t xml:space="preserve">CT angiography</w:t>
+            </w:r>
+            <w:r>
+              <w:t xml:space="preserve"> o </w:t>
+            </w:r>
+            <w:r>
+              <w:rPr>
+                <w:b/>
+                <w:bCs/>
+              </w:rPr>
+              <w:t xml:space="preserve">MR angiography</w:t>
+            </w:r>
+            <w:r>
+              <w:t xml:space="preserve">, como podéis ver aquí. El </w:t>
+            </w:r>
+            <w:r>
+              <w:rPr>
+                <w:b/>
+                <w:bCs/>
+              </w:rPr>
+              <w:t xml:space="preserve">screening</w:t>
+            </w:r>
+            <w:r>
+              <w:t xml:space="preserve"> es útil en familias con dos o más familiares afectados: el 11% tenía un aneurisma.</w:t>
             </w:r>
           </w:p>
         </w:tc>
@@ -9718,17 +9816,37 @@
               <w:t xml:space="preserve">[A] </w:t>
             </w:r>
             <w:r>
-              <w:t xml:space="preserve">An unruptured aneurysm is often silent. Most people do not know they have one. However, a big aneurysm can press on a nerve, like in this picture. Then the patient may have a headache, vision changes or a </w:t>
-            </w:r>
-            <w:r>
-              <w:rPr>
-                <w:b/>
-                <w:bCs/>
-              </w:rPr>
-              <w:t xml:space="preserve">nerve palsy</w:t>
-            </w:r>
-            <w:r>
-              <w:t xml:space="preserve">.</w:t>
+              <w:t xml:space="preserve">Most unruptured aneurysms are found by chance, in a scan done for another reason. Doctors use </w:t>
+            </w:r>
+            <w:r>
+              <w:rPr>
+                <w:b/>
+                <w:bCs/>
+              </w:rPr>
+              <w:t xml:space="preserve">CT angiography</w:t>
+            </w:r>
+            <w:r>
+              <w:t xml:space="preserve"> or </w:t>
+            </w:r>
+            <w:r>
+              <w:rPr>
+                <w:b/>
+                <w:bCs/>
+              </w:rPr>
+              <w:t xml:space="preserve">MR angiography</w:t>
+            </w:r>
+            <w:r>
+              <w:t xml:space="preserve">, as you can see here. </w:t>
+            </w:r>
+            <w:r>
+              <w:rPr>
+                <w:b/>
+                <w:bCs/>
+              </w:rPr>
+              <w:t xml:space="preserve">Screening</w:t>
+            </w:r>
+            <w:r>
+              <w:t xml:space="preserve"> is useful in families with two or more affected relatives: 11% had an aneurysm.</w:t>
             </w:r>
           </w:p>
         </w:tc>
@@ -9768,27 +9886,67 @@
               <w:t xml:space="preserve">[B] </w:t>
             </w:r>
             <w:r>
-              <w:t xml:space="preserve">En cambio, un aneurisma roto es muy "ruidoso". El paciente siente "el peor dolor de cabeza de mi vida", en segundos (</w:t>
-            </w:r>
-            <w:r>
-              <w:rPr>
-                <w:b/>
-                <w:bCs/>
-              </w:rPr>
-              <w:t xml:space="preserve">thunderclap headache</w:t>
-            </w:r>
-            <w:r>
-              <w:t xml:space="preserve">). Hay vómitos, la luz molesta a los ojos (</w:t>
-            </w:r>
-            <w:r>
-              <w:rPr>
-                <w:b/>
-                <w:bCs/>
-              </w:rPr>
-              <w:t xml:space="preserve">photophobia</w:t>
-            </w:r>
-            <w:r>
-              <w:t xml:space="preserve">) y el cuello está rígido. Hasta en el 43% de los casos hay antes un dolor de cabeza de aviso.</w:t>
+              <w:t xml:space="preserve">Para un aneurisma roto hay cuatro pasos. Primero, un </w:t>
+            </w:r>
+            <w:r>
+              <w:rPr>
+                <w:b/>
+                <w:bCs/>
+              </w:rPr>
+              <w:t xml:space="preserve">CT</w:t>
+            </w:r>
+            <w:r>
+              <w:t xml:space="preserve">: en las primeras 6 horas detecta casi el 100% de los sangrados. Segundo, si el </w:t>
+            </w:r>
+            <w:r>
+              <w:rPr>
+                <w:b/>
+                <w:bCs/>
+              </w:rPr>
+              <w:t xml:space="preserve">CT</w:t>
+            </w:r>
+            <w:r>
+              <w:t xml:space="preserve"> es normal, una punción lumbar (</w:t>
+            </w:r>
+            <w:r>
+              <w:rPr>
+                <w:b/>
+                <w:bCs/>
+              </w:rPr>
+              <w:t xml:space="preserve">lumbar puncture</w:t>
+            </w:r>
+            <w:r>
+              <w:t xml:space="preserve">). Tercero, la </w:t>
+            </w:r>
+            <w:r>
+              <w:rPr>
+                <w:b/>
+                <w:bCs/>
+              </w:rPr>
+              <w:t xml:space="preserve">CT angiography</w:t>
+            </w:r>
+            <w:r>
+              <w:t xml:space="preserve"> encuentra el aneurisma. Por último, la </w:t>
+            </w:r>
+            <w:r>
+              <w:rPr>
+                <w:b/>
+                <w:bCs/>
+              </w:rPr>
+              <w:t xml:space="preserve">DSA</w:t>
+            </w:r>
+            <w:r>
+              <w:t xml:space="preserve"> es el </w:t>
+            </w:r>
+            <w:r>
+              <w:rPr>
+                <w:b/>
+                <w:bCs/>
+              </w:rPr>
+              <w:t xml:space="preserve">gold standard</w:t>
+            </w:r>
+            <w:r>
+              <w:t xml:space="preserve">.</w:t>
             </w:r>
           </w:p>
         </w:tc>
@@ -9823,7 +9981,67 @@
               <w:t xml:space="preserve">[B] </w:t>
             </w:r>
             <w:r>
-              <w:t xml:space="preserve">In contrast, a ruptured aneurysm is very loud. The patient feels "the worst headache of my life", in seconds. There is vomiting, light hurts the eyes and the neck is stiff. In up to 43% of cases, there is a warning headache before.</w:t>
+              <w:t xml:space="preserve">For a ruptured aneurysm, there are four steps. First, a </w:t>
+            </w:r>
+            <w:r>
+              <w:rPr>
+                <w:b/>
+                <w:bCs/>
+              </w:rPr>
+              <w:t xml:space="preserve">CT</w:t>
+            </w:r>
+            <w:r>
+              <w:t xml:space="preserve">: in the first 6 hours, it finds almost 100% of bleeds. Second, if the </w:t>
+            </w:r>
+            <w:r>
+              <w:rPr>
+                <w:b/>
+                <w:bCs/>
+              </w:rPr>
+              <w:t xml:space="preserve">CT</w:t>
+            </w:r>
+            <w:r>
+              <w:t xml:space="preserve"> is normal, a </w:t>
+            </w:r>
+            <w:r>
+              <w:rPr>
+                <w:b/>
+                <w:bCs/>
+              </w:rPr>
+              <w:t xml:space="preserve">lumbar puncture</w:t>
+            </w:r>
+            <w:r>
+              <w:t xml:space="preserve">. Third, </w:t>
+            </w:r>
+            <w:r>
+              <w:rPr>
+                <w:b/>
+                <w:bCs/>
+              </w:rPr>
+              <w:t xml:space="preserve">CT angiography</w:t>
+            </w:r>
+            <w:r>
+              <w:t xml:space="preserve"> finds the aneurysm. Finally, </w:t>
+            </w:r>
+            <w:r>
+              <w:rPr>
+                <w:b/>
+                <w:bCs/>
+              </w:rPr>
+              <w:t xml:space="preserve">DSA</w:t>
+            </w:r>
+            <w:r>
+              <w:t xml:space="preserve"> is the </w:t>
+            </w:r>
+            <w:r>
+              <w:rPr>
+                <w:b/>
+                <w:bCs/>
+              </w:rPr>
+              <w:t xml:space="preserve">gold standard</w:t>
+            </w:r>
+            <w:r>
+              <w:t xml:space="preserve">.</w:t>
             </w:r>
           </w:p>
         </w:tc>
@@ -9864,7 +10082,7 @@
               <w:t xml:space="preserve">Pronunciación:</w:t>
             </w:r>
             <w:r>
-              <w:t xml:space="preserve"> thunderclap /THUN-der-klap/ · photophobia /foh-toh-FOH-bee-uh/ · palsy /PAWL-zee/ · vomiting /VOM-ih-ting/</w:t>
+              <w:t xml:space="preserve"> xanthochromia /zan-thoh-KROH-mee-uh/ · lumbar puncture /LUM-bar PUNK-cher/ · CT = "see-tee" · DSA = "dee-es-ay"</w:t>
             </w:r>
           </w:p>
           <w:p>
@@ -9881,7 +10099,7 @@
               <w:t xml:space="preserve">Relevo:</w:t>
             </w:r>
             <w:r>
-              <w:t xml:space="preserve"> A → B: "…or a nerve palsy." → B: "In contrast, …"</w:t>
+              <w:t xml:space="preserve"> A → B: "…11% had an aneurysm." → B: "For a ruptured aneurysm, …"</w:t>
             </w:r>
           </w:p>
         </w:tc>
@@ -9945,7 +10163,7 @@
                 <w:sz w:val="26"/>
                 <w:szCs w:val="26"/>
               </w:rPr>
-              <w:t xml:space="preserve">12 · Diagnosis</w:t>
+              <w:t xml:space="preserve">12 · Prevention</w:t>
             </w:r>
             <w:r>
               <w:rPr>
@@ -9953,7 +10171,7 @@
                 <w:sz w:val="22"/>
                 <w:szCs w:val="22"/>
               </w:rPr>
-              <w:t xml:space="preserve">     Habla: A + B  ·  ≈ 50 s</w:t>
+              <w:t xml:space="preserve">     Habla: A + B  ·  ≈ 40 s</w:t>
             </w:r>
           </w:p>
         </w:tc>
@@ -10070,37 +10288,27 @@
               <w:t xml:space="preserve">[A] </w:t>
             </w:r>
             <w:r>
-              <w:t xml:space="preserve">La mayoría de los aneurismas no rotos se encuentran por casualidad, en una prueba hecha por otro motivo. Los médicos usan </w:t>
-            </w:r>
-            <w:r>
-              <w:rPr>
-                <w:b/>
-                <w:bCs/>
-              </w:rPr>
-              <w:t xml:space="preserve">CT angiography</w:t>
-            </w:r>
-            <w:r>
-              <w:t xml:space="preserve"> o </w:t>
-            </w:r>
-            <w:r>
-              <w:rPr>
-                <w:b/>
-                <w:bCs/>
-              </w:rPr>
-              <w:t xml:space="preserve">MR angiography</w:t>
-            </w:r>
-            <w:r>
-              <w:t xml:space="preserve">, como podéis ver aquí. El </w:t>
-            </w:r>
-            <w:r>
-              <w:rPr>
-                <w:b/>
-                <w:bCs/>
-              </w:rPr>
-              <w:t xml:space="preserve">screening</w:t>
-            </w:r>
-            <w:r>
-              <w:t xml:space="preserve"> es útil en familias con dos o más familiares afectados: el 11% tenía un aneurisma.</w:t>
+              <w:t xml:space="preserve">Para prevenir la rotura, la guía europea recomienda dejar de fumar, tratar la tensión alta y controlar el aneurisma con pruebas de imagen periódicas. Las </w:t>
+            </w:r>
+            <w:r>
+              <w:rPr>
+                <w:b/>
+                <w:bCs/>
+              </w:rPr>
+              <w:t xml:space="preserve">statins</w:t>
+            </w:r>
+            <w:r>
+              <w:t xml:space="preserve"> y la </w:t>
+            </w:r>
+            <w:r>
+              <w:rPr>
+                <w:b/>
+                <w:bCs/>
+              </w:rPr>
+              <w:t xml:space="preserve">aspirin</w:t>
+            </w:r>
+            <w:r>
+              <w:t xml:space="preserve"> no se recomiendan para esto.</w:t>
             </w:r>
           </w:p>
         </w:tc>
@@ -10135,37 +10343,27 @@
               <w:t xml:space="preserve">[A] </w:t>
             </w:r>
             <w:r>
-              <w:t xml:space="preserve">Most unruptured aneurysms are found by chance, in a scan done for another reason. Doctors use </w:t>
-            </w:r>
-            <w:r>
-              <w:rPr>
-                <w:b/>
-                <w:bCs/>
-              </w:rPr>
-              <w:t xml:space="preserve">CT angiography</w:t>
-            </w:r>
-            <w:r>
-              <w:t xml:space="preserve"> or </w:t>
-            </w:r>
-            <w:r>
-              <w:rPr>
-                <w:b/>
-                <w:bCs/>
-              </w:rPr>
-              <w:t xml:space="preserve">MR angiography</w:t>
-            </w:r>
-            <w:r>
-              <w:t xml:space="preserve">, as you can see here. </w:t>
-            </w:r>
-            <w:r>
-              <w:rPr>
-                <w:b/>
-                <w:bCs/>
-              </w:rPr>
-              <w:t xml:space="preserve">Screening</w:t>
-            </w:r>
-            <w:r>
-              <w:t xml:space="preserve"> is useful in families with two or more affected relatives: 11% had an aneurysm.</w:t>
+              <w:t xml:space="preserve">To prevent rupture, the European guideline recommends stopping smoking, treating high blood pressure and checking the aneurysm with regular scans. </w:t>
+            </w:r>
+            <w:r>
+              <w:rPr>
+                <w:b/>
+                <w:bCs/>
+              </w:rPr>
+              <w:t xml:space="preserve">Statins</w:t>
+            </w:r>
+            <w:r>
+              <w:t xml:space="preserve"> and </w:t>
+            </w:r>
+            <w:r>
+              <w:rPr>
+                <w:b/>
+                <w:bCs/>
+              </w:rPr>
+              <w:t xml:space="preserve">aspirin</w:t>
+            </w:r>
+            <w:r>
+              <w:t xml:space="preserve"> are not recommended for this.</w:t>
             </w:r>
           </w:p>
         </w:tc>
@@ -10205,67 +10403,27 @@
               <w:t xml:space="preserve">[B] </w:t>
             </w:r>
             <w:r>
-              <w:t xml:space="preserve">Para un aneurisma roto hay cuatro pasos. Primero, un </w:t>
-            </w:r>
-            <w:r>
-              <w:rPr>
-                <w:b/>
-                <w:bCs/>
-              </w:rPr>
-              <w:t xml:space="preserve">CT</w:t>
-            </w:r>
-            <w:r>
-              <w:t xml:space="preserve">: en las primeras 6 horas detecta casi el 100% de los sangrados. Segundo, si el </w:t>
-            </w:r>
-            <w:r>
-              <w:rPr>
-                <w:b/>
-                <w:bCs/>
-              </w:rPr>
-              <w:t xml:space="preserve">CT</w:t>
-            </w:r>
-            <w:r>
-              <w:t xml:space="preserve"> es normal, una punción lumbar (</w:t>
-            </w:r>
-            <w:r>
-              <w:rPr>
-                <w:b/>
-                <w:bCs/>
-              </w:rPr>
-              <w:t xml:space="preserve">lumbar puncture</w:t>
-            </w:r>
-            <w:r>
-              <w:t xml:space="preserve">). Tercero, la </w:t>
-            </w:r>
-            <w:r>
-              <w:rPr>
-                <w:b/>
-                <w:bCs/>
-              </w:rPr>
-              <w:t xml:space="preserve">CT angiography</w:t>
-            </w:r>
-            <w:r>
-              <w:t xml:space="preserve"> encuentra el aneurisma. Por último, la </w:t>
-            </w:r>
-            <w:r>
-              <w:rPr>
-                <w:b/>
-                <w:bCs/>
-              </w:rPr>
-              <w:t xml:space="preserve">DSA</w:t>
-            </w:r>
-            <w:r>
-              <w:t xml:space="preserve"> es el </w:t>
-            </w:r>
-            <w:r>
-              <w:rPr>
-                <w:b/>
-                <w:bCs/>
-              </w:rPr>
-              <w:t xml:space="preserve">gold standard</w:t>
-            </w:r>
-            <w:r>
-              <w:t xml:space="preserve">.</w:t>
+              <w:t xml:space="preserve">Después de la rotura, el objetivo es distinto. Primero, hay que evitar un nuevo sangrado, que es muy peligroso: el aneurisma se cierra en menos de 24 horas. Segundo, protegemos el cerebro con </w:t>
+            </w:r>
+            <w:r>
+              <w:rPr>
+                <w:b/>
+                <w:bCs/>
+              </w:rPr>
+              <w:t xml:space="preserve">nimodipine</w:t>
+            </w:r>
+            <w:r>
+              <w:t xml:space="preserve"> y líquidos normales (</w:t>
+            </w:r>
+            <w:r>
+              <w:rPr>
+                <w:b/>
+                <w:bCs/>
+              </w:rPr>
+              <w:t xml:space="preserve">normal fluids</w:t>
+            </w:r>
+            <w:r>
+              <w:t xml:space="preserve">).</w:t>
             </w:r>
           </w:p>
         </w:tc>
@@ -10300,64 +10458,24 @@
               <w:t xml:space="preserve">[B] </w:t>
             </w:r>
             <w:r>
-              <w:t xml:space="preserve">For a ruptured aneurysm, there are four steps. First, a </w:t>
-            </w:r>
-            <w:r>
-              <w:rPr>
-                <w:b/>
-                <w:bCs/>
-              </w:rPr>
-              <w:t xml:space="preserve">CT</w:t>
-            </w:r>
-            <w:r>
-              <w:t xml:space="preserve">: in the first 6 hours, it finds almost 100% of bleeds. Second, if the </w:t>
-            </w:r>
-            <w:r>
-              <w:rPr>
-                <w:b/>
-                <w:bCs/>
-              </w:rPr>
-              <w:t xml:space="preserve">CT</w:t>
-            </w:r>
-            <w:r>
-              <w:t xml:space="preserve"> is normal, a </w:t>
-            </w:r>
-            <w:r>
-              <w:rPr>
-                <w:b/>
-                <w:bCs/>
-              </w:rPr>
-              <w:t xml:space="preserve">lumbar puncture</w:t>
-            </w:r>
-            <w:r>
-              <w:t xml:space="preserve">. Third, </w:t>
-            </w:r>
-            <w:r>
-              <w:rPr>
-                <w:b/>
-                <w:bCs/>
-              </w:rPr>
-              <w:t xml:space="preserve">CT angiography</w:t>
-            </w:r>
-            <w:r>
-              <w:t xml:space="preserve"> finds the aneurysm. Finally, </w:t>
-            </w:r>
-            <w:r>
-              <w:rPr>
-                <w:b/>
-                <w:bCs/>
-              </w:rPr>
-              <w:t xml:space="preserve">DSA</w:t>
-            </w:r>
-            <w:r>
-              <w:t xml:space="preserve"> is the </w:t>
-            </w:r>
-            <w:r>
-              <w:rPr>
-                <w:b/>
-                <w:bCs/>
-              </w:rPr>
-              <w:t xml:space="preserve">gold standard</w:t>
+              <w:t xml:space="preserve">After rupture, the aim is different. First, we must stop a new bleed, which is very dangerous: the aneurysm is closed in less than 24 hours. Second, we protect the brain with </w:t>
+            </w:r>
+            <w:r>
+              <w:rPr>
+                <w:b/>
+                <w:bCs/>
+              </w:rPr>
+              <w:t xml:space="preserve">nimodipine</w:t>
+            </w:r>
+            <w:r>
+              <w:t xml:space="preserve"> and </w:t>
+            </w:r>
+            <w:r>
+              <w:rPr>
+                <w:b/>
+                <w:bCs/>
+              </w:rPr>
+              <w:t xml:space="preserve">normal fluids</w:t>
             </w:r>
             <w:r>
               <w:t xml:space="preserve">.</w:t>
@@ -10401,7 +10519,7 @@
               <w:t xml:space="preserve">Pronunciación:</w:t>
             </w:r>
             <w:r>
-              <w:t xml:space="preserve"> xanthochromia /zan-thoh-KROH-mee-uh/ · lumbar puncture /LUM-bar PUNK-cher/ · CT = "see-tee" · DSA = "dee-es-ay"</w:t>
+              <w:t xml:space="preserve"> nimodipine /ni-MOH-di-peen/ · aspirin /AS-prin/ · statins /STAT-inz/</w:t>
             </w:r>
           </w:p>
           <w:p>
@@ -10418,7 +10536,7 @@
               <w:t xml:space="preserve">Relevo:</w:t>
             </w:r>
             <w:r>
-              <w:t xml:space="preserve"> A → B: "…11% had an aneurysm." → B: "For a ruptured aneurysm, …"</w:t>
+              <w:t xml:space="preserve"> B → A: "Now my colleague will explain the treatment of unruptured aneurysms."</w:t>
             </w:r>
           </w:p>
         </w:tc>
@@ -10482,7 +10600,7 @@
                 <w:sz w:val="26"/>
                 <w:szCs w:val="26"/>
               </w:rPr>
-              <w:t xml:space="preserve">13 · Prevention</w:t>
+              <w:t xml:space="preserve">13 · Treatment · Unruptured</w:t>
             </w:r>
             <w:r>
               <w:rPr>
@@ -10490,7 +10608,7 @@
                 <w:sz w:val="22"/>
                 <w:szCs w:val="22"/>
               </w:rPr>
-              <w:t xml:space="preserve">     Habla: A + B  ·  ≈ 40 s</w:t>
+              <w:t xml:space="preserve">     Habla: A  ·  ≈ 40 s</w:t>
             </w:r>
           </w:p>
         </w:tc>
@@ -10600,34 +10718,47 @@
               <w:spacing w:after="60"/>
             </w:pPr>
             <w:r>
-              <w:rPr>
-                <w:b/>
-                <w:bCs/>
-              </w:rPr>
-              <w:t xml:space="preserve">[A] </w:t>
-            </w:r>
-            <w:r>
-              <w:t xml:space="preserve">Para prevenir la rotura, la guía europea recomienda dejar de fumar, tratar la tensión alta y controlar el aneurisma con pruebas de imagen periódicas. Las </w:t>
-            </w:r>
-            <w:r>
-              <w:rPr>
-                <w:b/>
-                <w:bCs/>
-              </w:rPr>
-              <w:t xml:space="preserve">statins</w:t>
-            </w:r>
-            <w:r>
-              <w:t xml:space="preserve"> y la </w:t>
-            </w:r>
-            <w:r>
-              <w:rPr>
-                <w:b/>
-                <w:bCs/>
-              </w:rPr>
-              <w:t xml:space="preserve">aspirin</w:t>
-            </w:r>
-            <w:r>
-              <w:t xml:space="preserve"> no se recomiendan para esto.</w:t>
+              <w:t xml:space="preserve">Cuando encontramos un aneurisma no roto, la gran pregunta es: ¿lo vigilamos o lo tratamos? La guía europea dice: trátalo si el riesgo de rotura es mayor que el riesgo del tratamiento. Los médicos miran el tamaño, la localización y la edad, y usan escalas como </w:t>
+            </w:r>
+            <w:r>
+              <w:rPr>
+                <w:b/>
+                <w:bCs/>
+              </w:rPr>
+              <w:t xml:space="preserve">PHASES</w:t>
+            </w:r>
+            <w:r>
+              <w:t xml:space="preserve">. Hay tres opciones: </w:t>
+            </w:r>
+            <w:r>
+              <w:rPr>
+                <w:b/>
+                <w:bCs/>
+              </w:rPr>
+              <w:t xml:space="preserve">clipping</w:t>
+            </w:r>
+            <w:r>
+              <w:t xml:space="preserve">, </w:t>
+            </w:r>
+            <w:r>
+              <w:rPr>
+                <w:b/>
+                <w:bCs/>
+              </w:rPr>
+              <w:t xml:space="preserve">coiling</w:t>
+            </w:r>
+            <w:r>
+              <w:t xml:space="preserve"> y </w:t>
+            </w:r>
+            <w:r>
+              <w:rPr>
+                <w:b/>
+                <w:bCs/>
+              </w:rPr>
+              <w:t xml:space="preserve">flow diverters</w:t>
+            </w:r>
+            <w:r>
+              <w:t xml:space="preserve">, estos solo cuando no hay una opción más segura. Ahora, veamos un vídeo corto.</w:t>
             </w:r>
           </w:p>
         </w:tc>
@@ -10655,34 +10786,47 @@
               <w:spacing w:after="60"/>
             </w:pPr>
             <w:r>
-              <w:rPr>
-                <w:b/>
-                <w:bCs/>
-              </w:rPr>
-              <w:t xml:space="preserve">[A] </w:t>
-            </w:r>
-            <w:r>
-              <w:t xml:space="preserve">To prevent rupture, the European guideline recommends stopping smoking, treating high blood pressure and checking the aneurysm with regular scans. </w:t>
-            </w:r>
-            <w:r>
-              <w:rPr>
-                <w:b/>
-                <w:bCs/>
-              </w:rPr>
-              <w:t xml:space="preserve">Statins</w:t>
-            </w:r>
-            <w:r>
-              <w:t xml:space="preserve"> and </w:t>
-            </w:r>
-            <w:r>
-              <w:rPr>
-                <w:b/>
-                <w:bCs/>
-              </w:rPr>
-              <w:t xml:space="preserve">aspirin</w:t>
-            </w:r>
-            <w:r>
-              <w:t xml:space="preserve"> are not recommended for this.</w:t>
+              <w:t xml:space="preserve">When we find an unruptured aneurysm, the big question is: should we watch it or treat it? The European guideline says: treat it if the risk of rupture is higher than the risk of the treatment. Doctors look at size, location and age, and they use scores like </w:t>
+            </w:r>
+            <w:r>
+              <w:rPr>
+                <w:b/>
+                <w:bCs/>
+              </w:rPr>
+              <w:t xml:space="preserve">PHASES</w:t>
+            </w:r>
+            <w:r>
+              <w:t xml:space="preserve">. There are three options: </w:t>
+            </w:r>
+            <w:r>
+              <w:rPr>
+                <w:b/>
+                <w:bCs/>
+              </w:rPr>
+              <w:t xml:space="preserve">clipping</w:t>
+            </w:r>
+            <w:r>
+              <w:t xml:space="preserve">, </w:t>
+            </w:r>
+            <w:r>
+              <w:rPr>
+                <w:b/>
+                <w:bCs/>
+              </w:rPr>
+              <w:t xml:space="preserve">coiling</w:t>
+            </w:r>
+            <w:r>
+              <w:t xml:space="preserve">, and </w:t>
+            </w:r>
+            <w:r>
+              <w:rPr>
+                <w:b/>
+                <w:bCs/>
+              </w:rPr>
+              <w:t xml:space="preserve">flow diverters</w:t>
+            </w:r>
+            <w:r>
+              <w:t xml:space="preserve">, only when there is no safer option. Now, let's watch a short video.</w:t>
             </w:r>
           </w:p>
         </w:tc>
@@ -10693,121 +10837,6 @@
         </w:trPr>
         <w:tc>
           <w:tcPr>
-            <w:tcW w:type="dxa" w:w="4819"/>
-            <w:tcBorders>
-              <w:top w:val="single" w:color="C9D3DD" w:sz="4"/>
-              <w:left w:val="single" w:color="C9D3DD" w:sz="4"/>
-              <w:bottom w:val="single" w:color="C9D3DD" w:sz="4"/>
-              <w:right w:val="single" w:color="C9D3DD" w:sz="4"/>
-            </w:tcBorders>
-            <w:shd w:fill="FBEDE7" w:color="auto" w:val="clear"/>
-            <w:tcMar>
-              <w:top w:type="dxa" w:w="100"/>
-              <w:left w:type="dxa" w:w="140"/>
-              <w:bottom w:type="dxa" w:w="100"/>
-              <w:right w:type="dxa" w:w="140"/>
-            </w:tcMar>
-          </w:tcPr>
-          <w:p>
-            <w:pPr>
-              <w:keepNext/>
-              <w:keepLines/>
-              <w:spacing w:after="60"/>
-            </w:pPr>
-            <w:r>
-              <w:rPr>
-                <w:b/>
-                <w:bCs/>
-              </w:rPr>
-              <w:t xml:space="preserve">[B] </w:t>
-            </w:r>
-            <w:r>
-              <w:t xml:space="preserve">Después de la rotura, el objetivo es distinto. Primero, hay que evitar un nuevo sangrado, que es muy peligroso: el aneurisma se cierra en menos de 24 horas. Segundo, protegemos el cerebro con </w:t>
-            </w:r>
-            <w:r>
-              <w:rPr>
-                <w:b/>
-                <w:bCs/>
-              </w:rPr>
-              <w:t xml:space="preserve">nimodipine</w:t>
-            </w:r>
-            <w:r>
-              <w:t xml:space="preserve"> y líquidos normales (</w:t>
-            </w:r>
-            <w:r>
-              <w:rPr>
-                <w:b/>
-                <w:bCs/>
-              </w:rPr>
-              <w:t xml:space="preserve">normal fluids</w:t>
-            </w:r>
-            <w:r>
-              <w:t xml:space="preserve">).</w:t>
-            </w:r>
-          </w:p>
-        </w:tc>
-        <w:tc>
-          <w:tcPr>
-            <w:tcW w:type="dxa" w:w="4819"/>
-            <w:tcBorders>
-              <w:top w:val="single" w:color="C9D3DD" w:sz="4"/>
-              <w:left w:val="single" w:color="C9D3DD" w:sz="4"/>
-              <w:bottom w:val="single" w:color="C9D3DD" w:sz="4"/>
-              <w:right w:val="single" w:color="C9D3DD" w:sz="4"/>
-            </w:tcBorders>
-            <w:shd w:fill="FBEDE7" w:color="auto" w:val="clear"/>
-            <w:tcMar>
-              <w:top w:type="dxa" w:w="100"/>
-              <w:left w:type="dxa" w:w="140"/>
-              <w:bottom w:type="dxa" w:w="100"/>
-              <w:right w:type="dxa" w:w="140"/>
-            </w:tcMar>
-          </w:tcPr>
-          <w:p>
-            <w:pPr>
-              <w:keepNext/>
-              <w:keepLines/>
-              <w:spacing w:after="60"/>
-            </w:pPr>
-            <w:r>
-              <w:rPr>
-                <w:b/>
-                <w:bCs/>
-              </w:rPr>
-              <w:t xml:space="preserve">[B] </w:t>
-            </w:r>
-            <w:r>
-              <w:t xml:space="preserve">After rupture, the aim is different. First, we must stop a new bleed, which is very dangerous: the aneurysm is closed in less than 24 hours. Second, we protect the brain with </w:t>
-            </w:r>
-            <w:r>
-              <w:rPr>
-                <w:b/>
-                <w:bCs/>
-              </w:rPr>
-              <w:t xml:space="preserve">nimodipine</w:t>
-            </w:r>
-            <w:r>
-              <w:t xml:space="preserve"> and </w:t>
-            </w:r>
-            <w:r>
-              <w:rPr>
-                <w:b/>
-                <w:bCs/>
-              </w:rPr>
-              <w:t xml:space="preserve">normal fluids</w:t>
-            </w:r>
-            <w:r>
-              <w:t xml:space="preserve">.</w:t>
-            </w:r>
-          </w:p>
-        </w:tc>
-      </w:tr>
-      <w:tr>
-        <w:trPr>
-          <w:cantSplit/>
-        </w:trPr>
-        <w:tc>
-          <w:tcPr>
             <w:tcW w:type="dxa" w:w="9638"/>
             <w:gridSpan w:val="2"/>
             <w:tcBorders>
@@ -10838,24 +10867,7 @@
               <w:t xml:space="preserve">Pronunciación:</w:t>
             </w:r>
             <w:r>
-              <w:t xml:space="preserve"> nimodipine /ni-MOH-di-peen/ · aspirin /AS-prin/ · statins /STAT-inz/</w:t>
-            </w:r>
-          </w:p>
-          <w:p>
-            <w:pPr>
-              <w:keepNext w:val="false"/>
-              <w:keepLines/>
-              <w:spacing w:after="60"/>
-            </w:pPr>
-            <w:r>
-              <w:rPr>
-                <w:b/>
-                <w:bCs/>
-              </w:rPr>
-              <w:t xml:space="preserve">Relevo:</w:t>
-            </w:r>
-            <w:r>
-              <w:t xml:space="preserve"> B → A: "Now my colleague will explain the treatment of unruptured aneurysms."</w:t>
+              <w:t xml:space="preserve"> diverter /dye-VER-ter/ · PHASES /FAY-ziz/ · location /loh-KAY-shun/</w:t>
             </w:r>
           </w:p>
         </w:tc>
@@ -10919,7 +10931,7 @@
                 <w:sz w:val="26"/>
                 <w:szCs w:val="26"/>
               </w:rPr>
-              <w:t xml:space="preserve">14 · Treatment · Unruptured</w:t>
+              <w:t xml:space="preserve">14 · Video · Coiling</w:t>
             </w:r>
             <w:r>
               <w:rPr>
@@ -10927,7 +10939,7 @@
                 <w:sz w:val="22"/>
                 <w:szCs w:val="22"/>
               </w:rPr>
-              <w:t xml:space="preserve">     Habla: A  ·  ≈ 40 s</w:t>
+              <w:t xml:space="preserve">     Habla: A  ·  ≈ 70 s</w:t>
             </w:r>
           </w:p>
         </w:tc>
@@ -11037,47 +11049,47 @@
               <w:spacing w:after="60"/>
             </w:pPr>
             <w:r>
-              <w:t xml:space="preserve">Cuando encontramos un aneurisma no roto, la gran pregunta es: ¿lo vigilamos o lo tratamos? La guía europea dice: trátalo si el riesgo de rotura es mayor que el riesgo del tratamiento. Los médicos miran el tamaño, la localización y la edad, y usan escalas como </w:t>
-            </w:r>
-            <w:r>
-              <w:rPr>
-                <w:b/>
-                <w:bCs/>
-              </w:rPr>
-              <w:t xml:space="preserve">PHASES</w:t>
-            </w:r>
-            <w:r>
-              <w:t xml:space="preserve">. Hay tres opciones: </w:t>
-            </w:r>
-            <w:r>
-              <w:rPr>
-                <w:b/>
-                <w:bCs/>
-              </w:rPr>
-              <w:t xml:space="preserve">clipping</w:t>
-            </w:r>
-            <w:r>
-              <w:t xml:space="preserve">, </w:t>
-            </w:r>
-            <w:r>
-              <w:rPr>
-                <w:b/>
-                <w:bCs/>
-              </w:rPr>
-              <w:t xml:space="preserve">coiling</w:t>
-            </w:r>
-            <w:r>
-              <w:t xml:space="preserve"> y </w:t>
-            </w:r>
-            <w:r>
-              <w:rPr>
-                <w:b/>
-                <w:bCs/>
-              </w:rPr>
-              <w:t xml:space="preserve">flow diverters</w:t>
-            </w:r>
-            <w:r>
-              <w:t xml:space="preserve">, estos solo cuando no hay una opción más segura. Ahora, veamos un vídeo corto.</w:t>
+              <w:t xml:space="preserve">Antes del vídeo: "Este vídeo muestra cómo se trata un aneurisma con </w:t>
+            </w:r>
+            <w:r>
+              <w:rPr>
+                <w:b/>
+                <w:bCs/>
+              </w:rPr>
+              <w:t xml:space="preserve">endovascular coiling</w:t>
+            </w:r>
+            <w:r>
+              <w:t xml:space="preserve">. Prestad atención al </w:t>
+            </w:r>
+            <w:r>
+              <w:rPr>
+                <w:b/>
+                <w:bCs/>
+              </w:rPr>
+              <w:t xml:space="preserve">catheter</w:t>
+            </w:r>
+            <w:r>
+              <w:t xml:space="preserve"> y a los </w:t>
+            </w:r>
+            <w:r>
+              <w:rPr>
+                <w:b/>
+                <w:bCs/>
+              </w:rPr>
+              <w:t xml:space="preserve">coils</w:t>
+            </w:r>
+            <w:r>
+              <w:t xml:space="preserve">." Después del vídeo: "Como hemos visto, los </w:t>
+            </w:r>
+            <w:r>
+              <w:rPr>
+                <w:b/>
+                <w:bCs/>
+              </w:rPr>
+              <w:t xml:space="preserve">coils</w:t>
+            </w:r>
+            <w:r>
+              <w:t xml:space="preserve"> rellenan el aneurisma y la sangre ya no entra. Dicho de otro modo, el riesgo de rotura disminuye."</w:t>
             </w:r>
           </w:p>
         </w:tc>
@@ -11105,47 +11117,47 @@
               <w:spacing w:after="60"/>
             </w:pPr>
             <w:r>
-              <w:t xml:space="preserve">When we find an unruptured aneurysm, the big question is: should we watch it or treat it? The European guideline says: treat it if the risk of rupture is higher than the risk of the treatment. Doctors look at size, location and age, and they use scores like </w:t>
-            </w:r>
-            <w:r>
-              <w:rPr>
-                <w:b/>
-                <w:bCs/>
-              </w:rPr>
-              <w:t xml:space="preserve">PHASES</w:t>
-            </w:r>
-            <w:r>
-              <w:t xml:space="preserve">. There are three options: </w:t>
-            </w:r>
-            <w:r>
-              <w:rPr>
-                <w:b/>
-                <w:bCs/>
-              </w:rPr>
-              <w:t xml:space="preserve">clipping</w:t>
-            </w:r>
-            <w:r>
-              <w:t xml:space="preserve">, </w:t>
-            </w:r>
-            <w:r>
-              <w:rPr>
-                <w:b/>
-                <w:bCs/>
-              </w:rPr>
-              <w:t xml:space="preserve">coiling</w:t>
-            </w:r>
-            <w:r>
-              <w:t xml:space="preserve">, and </w:t>
-            </w:r>
-            <w:r>
-              <w:rPr>
-                <w:b/>
-                <w:bCs/>
-              </w:rPr>
-              <w:t xml:space="preserve">flow diverters</w:t>
-            </w:r>
-            <w:r>
-              <w:t xml:space="preserve">, only when there is no safer option. Now, let's watch a short video.</w:t>
+              <w:t xml:space="preserve">Before the video: "This video shows how an aneurysm is treated with </w:t>
+            </w:r>
+            <w:r>
+              <w:rPr>
+                <w:b/>
+                <w:bCs/>
+              </w:rPr>
+              <w:t xml:space="preserve">endovascular coiling</w:t>
+            </w:r>
+            <w:r>
+              <w:t xml:space="preserve">. Please pay attention to the </w:t>
+            </w:r>
+            <w:r>
+              <w:rPr>
+                <w:b/>
+                <w:bCs/>
+              </w:rPr>
+              <w:t xml:space="preserve">catheter</w:t>
+            </w:r>
+            <w:r>
+              <w:t xml:space="preserve"> and the </w:t>
+            </w:r>
+            <w:r>
+              <w:rPr>
+                <w:b/>
+                <w:bCs/>
+              </w:rPr>
+              <w:t xml:space="preserve">coils</w:t>
+            </w:r>
+            <w:r>
+              <w:t xml:space="preserve">." After the video: "As we have seen, the </w:t>
+            </w:r>
+            <w:r>
+              <w:rPr>
+                <w:b/>
+                <w:bCs/>
+              </w:rPr>
+              <w:t xml:space="preserve">coils</w:t>
+            </w:r>
+            <w:r>
+              <w:t xml:space="preserve"> fill the aneurysm and blood no longer enters it. In other words, the risk of rupture decreases."</w:t>
             </w:r>
           </w:p>
         </w:tc>
@@ -11186,7 +11198,45 @@
               <w:t xml:space="preserve">Pronunciación:</w:t>
             </w:r>
             <w:r>
-              <w:t xml:space="preserve"> diverter /dye-VER-ter/ · PHASES /FAY-ziz/ · location /loh-KAY-shun/</w:t>
+              <w:t xml:space="preserve"> catheter /KATH-ih-ter/ · coils /koylz/ · decreases /dee-KREE-siz/</w:t>
+            </w:r>
+          </w:p>
+          <w:p>
+            <w:pPr>
+              <w:keepNext w:val="false"/>
+              <w:keepLines/>
+              <w:spacing w:after="60"/>
+            </w:pPr>
+            <w:r>
+              <w:rPr>
+                <w:b/>
+                <w:bCs/>
+              </w:rPr>
+              <w:t xml:space="preserve">Relevo:</w:t>
+            </w:r>
+            <w:r>
+              <w:t xml:space="preserve"> A → B: "Now my colleague will explain the treatment after rupture."</w:t>
+            </w:r>
+          </w:p>
+          <w:p>
+            <w:pPr>
+              <w:keepNext w:val="false"/>
+              <w:keepLines/>
+              <w:spacing w:after="60"/>
+            </w:pPr>
+            <w:r>
+              <w:rPr>
+                <w:b/>
+                <w:bCs/>
+                <w:color w:val="6B7785"/>
+              </w:rPr>
+              <w:t xml:space="preserve">Nota:</w:t>
+            </w:r>
+            <w:r>
+              <w:rPr>
+                <w:color w:val="6B7785"/>
+              </w:rPr>
+              <w:t xml:space="preserve"> El vídeo dura 55 s y empieza al hacer clic. Unos 15 s de frases antes y después.</w:t>
             </w:r>
           </w:p>
         </w:tc>
@@ -11250,7 +11300,7 @@
                 <w:sz w:val="26"/>
                 <w:szCs w:val="26"/>
               </w:rPr>
-              <w:t xml:space="preserve">15 · Video · Coiling</w:t>
+              <w:t xml:space="preserve">15 · Treatment · Ruptured</w:t>
             </w:r>
             <w:r>
               <w:rPr>
@@ -11258,7 +11308,7 @@
                 <w:sz w:val="22"/>
                 <w:szCs w:val="22"/>
               </w:rPr>
-              <w:t xml:space="preserve">     Habla: A  ·  ≈ 70 s</w:t>
+              <w:t xml:space="preserve">     Habla: B  ·  ≈ 45 s</w:t>
             </w:r>
           </w:p>
         </w:tc>
@@ -11353,7 +11403,7 @@
               <w:bottom w:val="single" w:color="C9D3DD" w:sz="4"/>
               <w:right w:val="single" w:color="C9D3DD" w:sz="4"/>
             </w:tcBorders>
-            <w:shd w:fill="E6F0F8" w:color="auto" w:val="clear"/>
+            <w:shd w:fill="FBEDE7" w:color="auto" w:val="clear"/>
             <w:tcMar>
               <w:top w:type="dxa" w:w="100"/>
               <w:left w:type="dxa" w:w="140"/>
@@ -11368,47 +11418,67 @@
               <w:spacing w:after="60"/>
             </w:pPr>
             <w:r>
-              <w:t xml:space="preserve">Antes del vídeo: "Este vídeo muestra cómo se trata un aneurisma con </w:t>
-            </w:r>
-            <w:r>
-              <w:rPr>
-                <w:b/>
-                <w:bCs/>
-              </w:rPr>
-              <w:t xml:space="preserve">endovascular coiling</w:t>
-            </w:r>
-            <w:r>
-              <w:t xml:space="preserve">. Prestad atención al </w:t>
-            </w:r>
-            <w:r>
-              <w:rPr>
-                <w:b/>
-                <w:bCs/>
-              </w:rPr>
-              <w:t xml:space="preserve">catheter</w:t>
-            </w:r>
-            <w:r>
-              <w:t xml:space="preserve"> y a los </w:t>
-            </w:r>
-            <w:r>
-              <w:rPr>
-                <w:b/>
-                <w:bCs/>
-              </w:rPr>
-              <w:t xml:space="preserve">coils</w:t>
-            </w:r>
-            <w:r>
-              <w:t xml:space="preserve">." Después del vídeo: "Como hemos visto, los </w:t>
-            </w:r>
-            <w:r>
-              <w:rPr>
-                <w:b/>
-                <w:bCs/>
-              </w:rPr>
-              <w:t xml:space="preserve">coils</w:t>
-            </w:r>
-            <w:r>
-              <w:t xml:space="preserve"> rellenan el aneurisma y la sangre ya no entra. Dicho de otro modo, el riesgo de rotura disminuye."</w:t>
+              <w:t xml:space="preserve">Gracias. Cuando el aneurisma se ha roto, el tratamiento es una urgencia. Primero, estabilizamos al paciente en la </w:t>
+            </w:r>
+            <w:r>
+              <w:rPr>
+                <w:b/>
+                <w:bCs/>
+              </w:rPr>
+              <w:t xml:space="preserve">neuro-ICU</w:t>
+            </w:r>
+            <w:r>
+              <w:t xml:space="preserve">. Segundo, cerramos el aneurisma en menos de 24 horas, con </w:t>
+            </w:r>
+            <w:r>
+              <w:rPr>
+                <w:b/>
+                <w:bCs/>
+              </w:rPr>
+              <w:t xml:space="preserve">clipping</w:t>
+            </w:r>
+            <w:r>
+              <w:t xml:space="preserve"> o </w:t>
+            </w:r>
+            <w:r>
+              <w:rPr>
+                <w:b/>
+                <w:bCs/>
+              </w:rPr>
+              <w:t xml:space="preserve">coiling</w:t>
+            </w:r>
+            <w:r>
+              <w:t xml:space="preserve">. ¿Cuál es mejor? El ensayo </w:t>
+            </w:r>
+            <w:r>
+              <w:rPr>
+                <w:b/>
+                <w:bCs/>
+              </w:rPr>
+              <w:t xml:space="preserve">ISAT</w:t>
+            </w:r>
+            <w:r>
+              <w:t xml:space="preserve"> mostró que, tras el </w:t>
+            </w:r>
+            <w:r>
+              <w:rPr>
+                <w:b/>
+                <w:bCs/>
+              </w:rPr>
+              <w:t xml:space="preserve">coiling</w:t>
+            </w:r>
+            <w:r>
+              <w:t xml:space="preserve">, menos pacientes estaban muertos o dependientes: 24% frente a 31%. A los 10 años, más pacientes eran independientes. Por lo tanto, se prefiere el </w:t>
+            </w:r>
+            <w:r>
+              <w:rPr>
+                <w:b/>
+                <w:bCs/>
+              </w:rPr>
+              <w:t xml:space="preserve">coiling</w:t>
+            </w:r>
+            <w:r>
+              <w:t xml:space="preserve"> cuando los dos son posibles.</w:t>
             </w:r>
           </w:p>
         </w:tc>
@@ -11421,7 +11491,7 @@
               <w:bottom w:val="single" w:color="C9D3DD" w:sz="4"/>
               <w:right w:val="single" w:color="C9D3DD" w:sz="4"/>
             </w:tcBorders>
-            <w:shd w:fill="E6F0F8" w:color="auto" w:val="clear"/>
+            <w:shd w:fill="FBEDE7" w:color="auto" w:val="clear"/>
             <w:tcMar>
               <w:top w:type="dxa" w:w="100"/>
               <w:left w:type="dxa" w:w="140"/>
@@ -11436,47 +11506,67 @@
               <w:spacing w:after="60"/>
             </w:pPr>
             <w:r>
-              <w:t xml:space="preserve">Before the video: "This video shows how an aneurysm is treated with </w:t>
-            </w:r>
-            <w:r>
-              <w:rPr>
-                <w:b/>
-                <w:bCs/>
-              </w:rPr>
-              <w:t xml:space="preserve">endovascular coiling</w:t>
-            </w:r>
-            <w:r>
-              <w:t xml:space="preserve">. Please pay attention to the </w:t>
-            </w:r>
-            <w:r>
-              <w:rPr>
-                <w:b/>
-                <w:bCs/>
-              </w:rPr>
-              <w:t xml:space="preserve">catheter</w:t>
-            </w:r>
-            <w:r>
-              <w:t xml:space="preserve"> and the </w:t>
-            </w:r>
-            <w:r>
-              <w:rPr>
-                <w:b/>
-                <w:bCs/>
-              </w:rPr>
-              <w:t xml:space="preserve">coils</w:t>
-            </w:r>
-            <w:r>
-              <w:t xml:space="preserve">." After the video: "As we have seen, the </w:t>
-            </w:r>
-            <w:r>
-              <w:rPr>
-                <w:b/>
-                <w:bCs/>
-              </w:rPr>
-              <w:t xml:space="preserve">coils</w:t>
-            </w:r>
-            <w:r>
-              <w:t xml:space="preserve"> fill the aneurysm and blood no longer enters it. In other words, the risk of rupture decreases."</w:t>
+              <w:t xml:space="preserve">Thank you. When the aneurysm has ruptured, treatment is an emergency. First, we stabilise the patient in the </w:t>
+            </w:r>
+            <w:r>
+              <w:rPr>
+                <w:b/>
+                <w:bCs/>
+              </w:rPr>
+              <w:t xml:space="preserve">neuro-ICU</w:t>
+            </w:r>
+            <w:r>
+              <w:t xml:space="preserve">. Second, we close the aneurysm in less than 24 hours, with </w:t>
+            </w:r>
+            <w:r>
+              <w:rPr>
+                <w:b/>
+                <w:bCs/>
+              </w:rPr>
+              <w:t xml:space="preserve">clipping</w:t>
+            </w:r>
+            <w:r>
+              <w:t xml:space="preserve"> or </w:t>
+            </w:r>
+            <w:r>
+              <w:rPr>
+                <w:b/>
+                <w:bCs/>
+              </w:rPr>
+              <w:t xml:space="preserve">coiling</w:t>
+            </w:r>
+            <w:r>
+              <w:t xml:space="preserve">. Which one is better? The </w:t>
+            </w:r>
+            <w:r>
+              <w:rPr>
+                <w:b/>
+                <w:bCs/>
+              </w:rPr>
+              <w:t xml:space="preserve">ISAT</w:t>
+            </w:r>
+            <w:r>
+              <w:t xml:space="preserve"> trial showed that after </w:t>
+            </w:r>
+            <w:r>
+              <w:rPr>
+                <w:b/>
+                <w:bCs/>
+              </w:rPr>
+              <w:t xml:space="preserve">coiling</w:t>
+            </w:r>
+            <w:r>
+              <w:t xml:space="preserve">, fewer patients were dead or dependent: 24% versus 31%. After 10 years, more patients were independent. Therefore, </w:t>
+            </w:r>
+            <w:r>
+              <w:rPr>
+                <w:b/>
+                <w:bCs/>
+              </w:rPr>
+              <w:t xml:space="preserve">coiling</w:t>
+            </w:r>
+            <w:r>
+              <w:t xml:space="preserve"> is preferred when both are possible.</w:t>
             </w:r>
           </w:p>
         </w:tc>
@@ -11517,7 +11607,7 @@
               <w:t xml:space="preserve">Pronunciación:</w:t>
             </w:r>
             <w:r>
-              <w:t xml:space="preserve"> catheter /KATH-ih-ter/ · coils /koylz/ · decreases /dee-KREE-siz/</w:t>
+              <w:t xml:space="preserve"> dependent /dih-PEN-dent/ · trial /TRY-ul/ · ICU = "eye-see-you" · versus /VER-sus/</w:t>
             </w:r>
           </w:p>
           <w:p>
@@ -11534,28 +11624,7 @@
               <w:t xml:space="preserve">Relevo:</w:t>
             </w:r>
             <w:r>
-              <w:t xml:space="preserve"> A → B: "Now my colleague will explain the treatment after rupture."</w:t>
-            </w:r>
-          </w:p>
-          <w:p>
-            <w:pPr>
-              <w:keepNext w:val="false"/>
-              <w:keepLines/>
-              <w:spacing w:after="60"/>
-            </w:pPr>
-            <w:r>
-              <w:rPr>
-                <w:b/>
-                <w:bCs/>
-                <w:color w:val="6B7785"/>
-              </w:rPr>
-              <w:t xml:space="preserve">Nota:</w:t>
-            </w:r>
-            <w:r>
-              <w:rPr>
-                <w:color w:val="6B7785"/>
-              </w:rPr>
-              <w:t xml:space="preserve"> El vídeo aún no está en la presentación. Calculado ~1 min de vídeo + 10 s de frases.</w:t>
+              <w:t xml:space="preserve"> B → A: "Now my colleague will explain the statistics."</w:t>
             </w:r>
           </w:p>
         </w:tc>
@@ -11619,7 +11688,7 @@
                 <w:sz w:val="26"/>
                 <w:szCs w:val="26"/>
               </w:rPr>
-              <w:t xml:space="preserve">16 · Treatment · Ruptured</w:t>
+              <w:t xml:space="preserve">16 · Statistics · Unruptured</w:t>
             </w:r>
             <w:r>
               <w:rPr>
@@ -11627,7 +11696,7 @@
                 <w:sz w:val="22"/>
                 <w:szCs w:val="22"/>
               </w:rPr>
-              <w:t xml:space="preserve">     Habla: B  ·  ≈ 45 s</w:t>
+              <w:t xml:space="preserve">     Habla: A  ·  ≈ 45 s</w:t>
             </w:r>
           </w:p>
         </w:tc>
@@ -11722,7 +11791,7 @@
               <w:bottom w:val="single" w:color="C9D3DD" w:sz="4"/>
               <w:right w:val="single" w:color="C9D3DD" w:sz="4"/>
             </w:tcBorders>
-            <w:shd w:fill="FBEDE7" w:color="auto" w:val="clear"/>
+            <w:shd w:fill="E6F0F8" w:color="auto" w:val="clear"/>
             <w:tcMar>
               <w:top w:type="dxa" w:w="100"/>
               <w:left w:type="dxa" w:w="140"/>
@@ -11737,67 +11806,27 @@
               <w:spacing w:after="60"/>
             </w:pPr>
             <w:r>
-              <w:t xml:space="preserve">Gracias. Cuando el aneurisma se ha roto, el tratamiento es una urgencia. Primero, estabilizamos al paciente en la </w:t>
-            </w:r>
-            <w:r>
-              <w:rPr>
-                <w:b/>
-                <w:bCs/>
-              </w:rPr>
-              <w:t xml:space="preserve">neuro-ICU</w:t>
-            </w:r>
-            <w:r>
-              <w:t xml:space="preserve">. Segundo, cerramos el aneurisma en menos de 24 horas, con </w:t>
-            </w:r>
-            <w:r>
-              <w:rPr>
-                <w:b/>
-                <w:bCs/>
-              </w:rPr>
-              <w:t xml:space="preserve">clipping</w:t>
-            </w:r>
-            <w:r>
-              <w:t xml:space="preserve"> o </w:t>
-            </w:r>
-            <w:r>
-              <w:rPr>
-                <w:b/>
-                <w:bCs/>
-              </w:rPr>
-              <w:t xml:space="preserve">coiling</w:t>
-            </w:r>
-            <w:r>
-              <w:t xml:space="preserve">. ¿Cuál es mejor? El ensayo </w:t>
-            </w:r>
-            <w:r>
-              <w:rPr>
-                <w:b/>
-                <w:bCs/>
-              </w:rPr>
-              <w:t xml:space="preserve">ISAT</w:t>
-            </w:r>
-            <w:r>
-              <w:t xml:space="preserve"> mostró que, tras el </w:t>
-            </w:r>
-            <w:r>
-              <w:rPr>
-                <w:b/>
-                <w:bCs/>
-              </w:rPr>
-              <w:t xml:space="preserve">coiling</w:t>
-            </w:r>
-            <w:r>
-              <w:t xml:space="preserve">, menos pacientes estaban muertos o dependientes: 24% frente a 31%. A los 10 años, más pacientes eran independientes. Por lo tanto, se prefiere el </w:t>
-            </w:r>
-            <w:r>
-              <w:rPr>
-                <w:b/>
-                <w:bCs/>
-              </w:rPr>
-              <w:t xml:space="preserve">coiling</w:t>
-            </w:r>
-            <w:r>
-              <w:t xml:space="preserve"> cuando los dos son posibles.</w:t>
+              <w:t xml:space="preserve">Ahora, la estadística. Un gran </w:t>
+            </w:r>
+            <w:r>
+              <w:rPr>
+                <w:b/>
+                <w:bCs/>
+              </w:rPr>
+              <w:t xml:space="preserve">meta-analysis</w:t>
+            </w:r>
+            <w:r>
+              <w:t xml:space="preserve"> encontró que el 3,2% de los adultos tiene un aneurisma no roto. Este gráfico muestra cuántas veces es más frecuente. Las mujeres tienen 1,6 veces más aneurismas que los hombres, y por encima de los 50 años, 2,2 veces más. Los antecedentes familiares lo multiplican por 3,4 y la </w:t>
+            </w:r>
+            <w:r>
+              <w:rPr>
+                <w:b/>
+                <w:bCs/>
+              </w:rPr>
+              <w:t xml:space="preserve">polycystic kidney disease</w:t>
+            </w:r>
+            <w:r>
+              <w:t xml:space="preserve"> por 6,9. Es muy raro por debajo de los 30. Curiosamente, Japón y Finlandia tienen el mismo número de aneurismas, pero se rompen más a menudo. Ahora mi compañero explicará la estadística de la rotura.</w:t>
             </w:r>
           </w:p>
         </w:tc>
@@ -11810,7 +11839,7 @@
               <w:bottom w:val="single" w:color="C9D3DD" w:sz="4"/>
               <w:right w:val="single" w:color="C9D3DD" w:sz="4"/>
             </w:tcBorders>
-            <w:shd w:fill="FBEDE7" w:color="auto" w:val="clear"/>
+            <w:shd w:fill="E6F0F8" w:color="auto" w:val="clear"/>
             <w:tcMar>
               <w:top w:type="dxa" w:w="100"/>
               <w:left w:type="dxa" w:w="140"/>
@@ -11825,67 +11854,27 @@
               <w:spacing w:after="60"/>
             </w:pPr>
             <w:r>
-              <w:t xml:space="preserve">Thank you. When the aneurysm has ruptured, treatment is an emergency. First, we stabilise the patient in the </w:t>
-            </w:r>
-            <w:r>
-              <w:rPr>
-                <w:b/>
-                <w:bCs/>
-              </w:rPr>
-              <w:t xml:space="preserve">neuro-ICU</w:t>
-            </w:r>
-            <w:r>
-              <w:t xml:space="preserve">. Second, we close the aneurysm in less than 24 hours, with </w:t>
-            </w:r>
-            <w:r>
-              <w:rPr>
-                <w:b/>
-                <w:bCs/>
-              </w:rPr>
-              <w:t xml:space="preserve">clipping</w:t>
-            </w:r>
-            <w:r>
-              <w:t xml:space="preserve"> or </w:t>
-            </w:r>
-            <w:r>
-              <w:rPr>
-                <w:b/>
-                <w:bCs/>
-              </w:rPr>
-              <w:t xml:space="preserve">coiling</w:t>
-            </w:r>
-            <w:r>
-              <w:t xml:space="preserve">. Which one is better? The </w:t>
-            </w:r>
-            <w:r>
-              <w:rPr>
-                <w:b/>
-                <w:bCs/>
-              </w:rPr>
-              <w:t xml:space="preserve">ISAT</w:t>
-            </w:r>
-            <w:r>
-              <w:t xml:space="preserve"> trial showed that after </w:t>
-            </w:r>
-            <w:r>
-              <w:rPr>
-                <w:b/>
-                <w:bCs/>
-              </w:rPr>
-              <w:t xml:space="preserve">coiling</w:t>
-            </w:r>
-            <w:r>
-              <w:t xml:space="preserve">, fewer patients were dead or dependent: 24% versus 31%. After 10 years, more patients were independent. Therefore, </w:t>
-            </w:r>
-            <w:r>
-              <w:rPr>
-                <w:b/>
-                <w:bCs/>
-              </w:rPr>
-              <w:t xml:space="preserve">coiling</w:t>
-            </w:r>
-            <w:r>
-              <w:t xml:space="preserve"> is preferred when both are possible.</w:t>
+              <w:t xml:space="preserve">Now, the statistics. A large </w:t>
+            </w:r>
+            <w:r>
+              <w:rPr>
+                <w:b/>
+                <w:bCs/>
+              </w:rPr>
+              <w:t xml:space="preserve">meta-analysis</w:t>
+            </w:r>
+            <w:r>
+              <w:t xml:space="preserve"> found that 3.2% of adults have an unruptured aneurysm. This graph shows how many times more common it is. Women have 1.6 times more aneurysms than men, and over 50 years, 2.2 times more. A family history multiplies it by 3.4, and </w:t>
+            </w:r>
+            <w:r>
+              <w:rPr>
+                <w:b/>
+                <w:bCs/>
+              </w:rPr>
+              <w:t xml:space="preserve">polycystic kidney disease</w:t>
+            </w:r>
+            <w:r>
+              <w:t xml:space="preserve"> by 6.9. It is very rare under 30. Interestingly, Japan and Finland have the same number of aneurysms, but they break more often. Now my colleague will explain the statistics of rupture.</w:t>
             </w:r>
           </w:p>
         </w:tc>
@@ -11926,7 +11915,7 @@
               <w:t xml:space="preserve">Pronunciación:</w:t>
             </w:r>
             <w:r>
-              <w:t xml:space="preserve"> dependent /dih-PEN-dent/ · trial /TRY-ul/ · ICU = "eye-see-you" · versus /VER-sus/</w:t>
+              <w:t xml:space="preserve"> prevalence /PREV-uh-lens/ · statistics /stuh-TIS-tiks/ · 1.6 = "one point six" · Interestingly /IN-tres-ting-lee/</w:t>
             </w:r>
           </w:p>
           <w:p>
@@ -11943,7 +11932,7 @@
               <w:t xml:space="preserve">Relevo:</w:t>
             </w:r>
             <w:r>
-              <w:t xml:space="preserve"> B → A: "Now my colleague will explain the statistics."</w:t>
+              <w:t xml:space="preserve"> A → B (ya incluido): "Now my colleague will explain the statistics of rupture."</w:t>
             </w:r>
           </w:p>
         </w:tc>
@@ -12007,7 +11996,7 @@
                 <w:sz w:val="26"/>
                 <w:szCs w:val="26"/>
               </w:rPr>
-              <w:t xml:space="preserve">17 · Statistics · Unruptured</w:t>
+              <w:t xml:space="preserve">17 · Statistics · By region</w:t>
             </w:r>
             <w:r>
               <w:rPr>
@@ -12015,7 +12004,7 @@
                 <w:sz w:val="22"/>
                 <w:szCs w:val="22"/>
               </w:rPr>
-              <w:t xml:space="preserve">     Habla: A  ·  ≈ 45 s</w:t>
+              <w:t xml:space="preserve">     Habla: B  ·  ≈ 30 s</w:t>
             </w:r>
           </w:p>
         </w:tc>
@@ -12110,7 +12099,7 @@
               <w:bottom w:val="single" w:color="C9D3DD" w:sz="4"/>
               <w:right w:val="single" w:color="C9D3DD" w:sz="4"/>
             </w:tcBorders>
-            <w:shd w:fill="E6F0F8" w:color="auto" w:val="clear"/>
+            <w:shd w:fill="FBEDE7" w:color="auto" w:val="clear"/>
             <w:tcMar>
               <w:top w:type="dxa" w:w="100"/>
               <w:left w:type="dxa" w:w="140"/>
@@ -12125,27 +12114,7 @@
               <w:spacing w:after="60"/>
             </w:pPr>
             <w:r>
-              <w:t xml:space="preserve">Ahora, la estadística. Un gran </w:t>
-            </w:r>
-            <w:r>
-              <w:rPr>
-                <w:b/>
-                <w:bCs/>
-              </w:rPr>
-              <w:t xml:space="preserve">meta-analysis</w:t>
-            </w:r>
-            <w:r>
-              <w:t xml:space="preserve"> encontró que el 3,2% de los adultos tiene un aneurisma no roto. Este gráfico muestra cuántas veces es más frecuente. Las mujeres tienen 1,6 veces más aneurismas que los hombres, y por encima de los 50 años, 2,2 veces más. Los antecedentes familiares lo multiplican por 3,4 y la </w:t>
-            </w:r>
-            <w:r>
-              <w:rPr>
-                <w:b/>
-                <w:bCs/>
-              </w:rPr>
-              <w:t xml:space="preserve">polycystic kidney disease</w:t>
-            </w:r>
-            <w:r>
-              <w:t xml:space="preserve"> por 6,9. Es muy raro por debajo de los 30. Curiosamente, Japón y Finlandia tienen el mismo número de aneurismas, pero se rompen más a menudo. Ahora mi compañero explicará la estadística de la rotura.</w:t>
+              <w:t xml:space="preserve">Gracias. Este gráfico muestra cuántas roturas ocurren por cada 100 000 personas al año. Los datos se recogieron de 75 estudios en 32 países. Como podemos ver, Japón y Finlandia tienen las cifras más altas. Japón tiene más del triple de la media mundial, que es 7,9.</w:t>
             </w:r>
           </w:p>
         </w:tc>
@@ -12158,7 +12127,7 @@
               <w:bottom w:val="single" w:color="C9D3DD" w:sz="4"/>
               <w:right w:val="single" w:color="C9D3DD" w:sz="4"/>
             </w:tcBorders>
-            <w:shd w:fill="E6F0F8" w:color="auto" w:val="clear"/>
+            <w:shd w:fill="FBEDE7" w:color="auto" w:val="clear"/>
             <w:tcMar>
               <w:top w:type="dxa" w:w="100"/>
               <w:left w:type="dxa" w:w="140"/>
@@ -12173,27 +12142,7 @@
               <w:spacing w:after="60"/>
             </w:pPr>
             <w:r>
-              <w:t xml:space="preserve">Now, the statistics. A large </w:t>
-            </w:r>
-            <w:r>
-              <w:rPr>
-                <w:b/>
-                <w:bCs/>
-              </w:rPr>
-              <w:t xml:space="preserve">meta-analysis</w:t>
-            </w:r>
-            <w:r>
-              <w:t xml:space="preserve"> found that 3.2% of adults have an unruptured aneurysm. This graph shows how many times more common it is. Women have 1.6 times more aneurysms than men, and over 50 years, 2.2 times more. A family history multiplies it by 3.4, and </w:t>
-            </w:r>
-            <w:r>
-              <w:rPr>
-                <w:b/>
-                <w:bCs/>
-              </w:rPr>
-              <w:t xml:space="preserve">polycystic kidney disease</w:t>
-            </w:r>
-            <w:r>
-              <w:t xml:space="preserve"> by 6.9. It is very rare under 30. Interestingly, Japan and Finland have the same number of aneurysms, but they break more often. Now my colleague will explain the statistics of rupture.</w:t>
+              <w:t xml:space="preserve">Thank you. This graph shows how many ruptures happen per 100 000 people every year. Data were collected from 75 studies in 32 countries. As we can see, Japan and Finland have the highest numbers. Japan has more than three times the world average, which is 7.9.</w:t>
             </w:r>
           </w:p>
         </w:tc>
@@ -12234,24 +12183,7 @@
               <w:t xml:space="preserve">Pronunciación:</w:t>
             </w:r>
             <w:r>
-              <w:t xml:space="preserve"> prevalence /PREV-uh-lens/ · statistics /stuh-TIS-tiks/ · 1.6 = "one point six" · Interestingly /IN-tres-ting-lee/</w:t>
-            </w:r>
-          </w:p>
-          <w:p>
-            <w:pPr>
-              <w:keepNext w:val="false"/>
-              <w:keepLines/>
-              <w:spacing w:after="60"/>
-            </w:pPr>
-            <w:r>
-              <w:rPr>
-                <w:b/>
-                <w:bCs/>
-              </w:rPr>
-              <w:t xml:space="preserve">Relevo:</w:t>
-            </w:r>
-            <w:r>
-              <w:t xml:space="preserve"> A → B (ya incluido): "Now my colleague will explain the statistics of rupture."</w:t>
+              <w:t xml:space="preserve"> incidence /IN-sih-dens/ · Finland /FIN-lund/ · 100 000 = "one hundred thousand" · average /AV-rij/</w:t>
             </w:r>
           </w:p>
         </w:tc>
@@ -12315,7 +12247,7 @@
                 <w:sz w:val="26"/>
                 <w:szCs w:val="26"/>
               </w:rPr>
-              <w:t xml:space="preserve">18 · Statistics · By region</w:t>
+              <w:t xml:space="preserve">18 · Statistics · Trend &amp; outcome</w:t>
             </w:r>
             <w:r>
               <w:rPr>
@@ -12323,7 +12255,7 @@
                 <w:sz w:val="22"/>
                 <w:szCs w:val="22"/>
               </w:rPr>
-              <w:t xml:space="preserve">     Habla: B  ·  ≈ 30 s</w:t>
+              <w:t xml:space="preserve">     Habla: B  ·  ≈ 35 s</w:t>
             </w:r>
           </w:p>
         </w:tc>
@@ -12433,7 +12365,7 @@
               <w:spacing w:after="60"/>
             </w:pPr>
             <w:r>
-              <w:t xml:space="preserve">Gracias. Este gráfico muestra cuántas roturas ocurren por cada 100 000 personas al año. Los datos se recogieron de 75 estudios en 32 países. Como podemos ver, Japón y Finlandia tienen las cifras más altas. Japón tiene más del triple de la media mundial, que es 7,9.</w:t>
+              <w:t xml:space="preserve">Primero, la buena noticia: en 30 años, las roturas bajaron un 40%, a la vez que se fumaba menos y se controlaba mejor la tensión. Las mujeres tienen un riesgo algo mayor y la edad media es 55 años. Sin embargo, el pronóstico sigue siendo malo: alrededor del 40% de los pacientes muere, hasta un 26% antes de llegar al hospital, y solo uno de cada tres vuelve a ser independiente.</w:t>
             </w:r>
           </w:p>
         </w:tc>
@@ -12461,7 +12393,7 @@
               <w:spacing w:after="60"/>
             </w:pPr>
             <w:r>
-              <w:t xml:space="preserve">Thank you. This graph shows how many ruptures happen per 100 000 people every year. Data were collected from 75 studies in 32 countries. As we can see, Japan and Finland have the highest numbers. Japan has more than three times the world average, which is 7.9.</w:t>
+              <w:t xml:space="preserve">Good news first: in 30 years, ruptures fell by 40%, in parallel with less smoking and better blood pressure control. Women have slightly more risk, and the mean age is 55. However, the outcome is still bad: about 40% of patients die, up to 26% before they reach hospital, and only one in three becomes independent again.</w:t>
             </w:r>
           </w:p>
         </w:tc>
@@ -12502,7 +12434,24 @@
               <w:t xml:space="preserve">Pronunciación:</w:t>
             </w:r>
             <w:r>
-              <w:t xml:space="preserve"> incidence /IN-sih-dens/ · Finland /FIN-lund/ · 100 000 = "one hundred thousand" · average /AV-rij/</w:t>
+              <w:t xml:space="preserve"> independent /in-dih-PEN-dent/ · slightly /SLITE-lee/ · outcome /OWT-kum/</w:t>
+            </w:r>
+          </w:p>
+          <w:p>
+            <w:pPr>
+              <w:keepNext w:val="false"/>
+              <w:keepLines/>
+              <w:spacing w:after="60"/>
+            </w:pPr>
+            <w:r>
+              <w:rPr>
+                <w:b/>
+                <w:bCs/>
+              </w:rPr>
+              <w:t xml:space="preserve">Relevo:</w:t>
+            </w:r>
+            <w:r>
+              <w:t xml:space="preserve"> B → A: "Now my colleague will present the discussion."</w:t>
             </w:r>
           </w:p>
         </w:tc>
@@ -12566,7 +12515,7 @@
                 <w:sz w:val="26"/>
                 <w:szCs w:val="26"/>
               </w:rPr>
-              <w:t xml:space="preserve">19 · Statistics · Trend &amp; outcome</w:t>
+              <w:t xml:space="preserve">19 · Discussion</w:t>
             </w:r>
             <w:r>
               <w:rPr>
@@ -12574,7 +12523,7 @@
                 <w:sz w:val="22"/>
                 <w:szCs w:val="22"/>
               </w:rPr>
-              <w:t xml:space="preserve">     Habla: B  ·  ≈ 35 s</w:t>
+              <w:t xml:space="preserve">     Habla: A  ·  ≈ 40 s</w:t>
             </w:r>
           </w:p>
         </w:tc>
@@ -12669,7 +12618,7 @@
               <w:bottom w:val="single" w:color="C9D3DD" w:sz="4"/>
               <w:right w:val="single" w:color="C9D3DD" w:sz="4"/>
             </w:tcBorders>
-            <w:shd w:fill="FBEDE7" w:color="auto" w:val="clear"/>
+            <w:shd w:fill="E6F0F8" w:color="auto" w:val="clear"/>
             <w:tcMar>
               <w:top w:type="dxa" w:w="100"/>
               <w:left w:type="dxa" w:w="140"/>
@@ -12684,7 +12633,7 @@
               <w:spacing w:after="60"/>
             </w:pPr>
             <w:r>
-              <w:t xml:space="preserve">Primero, la buena noticia: en 30 años, las roturas bajaron un 40%, a la vez que se fumaba menos y se controlaba mejor la tensión. Las mujeres tienen un riesgo algo mayor y la edad media es 55 años. Sin embargo, el pronóstico sigue siendo malo: alrededor del 40% de los pacientes muere, hasta un 26% antes de llegar al hospital, y solo uno de cada tres vuelve a ser independiente.</w:t>
+              <w:t xml:space="preserve">Nuestro estudio confirma que los aneurismas son frecuentes pero a menudo silenciosos, que la rotura es mortal y que el tratamiento precoz salva vidas. Sin embargo, tenemos limitaciones. Es solo un estudio bibliográfico, con datos de pocos países y ninguno de España. Además, no hay ensayos terminados para los aneurismas no rotos. Hace falta más investigación, sobre todo para saber cuándo tratar los aneurismas pequeños.</w:t>
             </w:r>
           </w:p>
         </w:tc>
@@ -12697,7 +12646,7 @@
               <w:bottom w:val="single" w:color="C9D3DD" w:sz="4"/>
               <w:right w:val="single" w:color="C9D3DD" w:sz="4"/>
             </w:tcBorders>
-            <w:shd w:fill="FBEDE7" w:color="auto" w:val="clear"/>
+            <w:shd w:fill="E6F0F8" w:color="auto" w:val="clear"/>
             <w:tcMar>
               <w:top w:type="dxa" w:w="100"/>
               <w:left w:type="dxa" w:w="140"/>
@@ -12712,7 +12661,7 @@
               <w:spacing w:after="60"/>
             </w:pPr>
             <w:r>
-              <w:t xml:space="preserve">Good news first: in 30 years, ruptures fell by 40%, in parallel with less smoking and better blood pressure control. Women have slightly more risk, and the mean age is 55. However, the outcome is still bad: about 40% of patients die, up to 26% before they reach hospital, and only one in three becomes independent again.</w:t>
+              <w:t xml:space="preserve">Our study confirms that aneurysms are common but often silent, that rupture is deadly, and that early treatment saves lives. However, we have limitations. This is only a bibliographic study, with data from few countries and none from Spain. Moreover, there are no completed trials for unruptured aneurysms. Further research is needed, especially to know when to treat small aneurysms.</w:t>
             </w:r>
           </w:p>
         </w:tc>
@@ -12753,7 +12702,7 @@
               <w:t xml:space="preserve">Pronunciación:</w:t>
             </w:r>
             <w:r>
-              <w:t xml:space="preserve"> independent /in-dih-PEN-dent/ · slightly /SLITE-lee/ · outcome /OWT-kum/</w:t>
+              <w:t xml:space="preserve"> limitations /lim-ih-TAY-shunz/ · further /FUR-ther/ · deadly /DED-lee/ · research /ree-SURCH/</w:t>
             </w:r>
           </w:p>
           <w:p>
@@ -12770,7 +12719,28 @@
               <w:t xml:space="preserve">Relevo:</w:t>
             </w:r>
             <w:r>
-              <w:t xml:space="preserve"> B → A: "Now my colleague will present the discussion."</w:t>
+              <w:t xml:space="preserve"> A → B: "Now my colleague will present the conclusion."</w:t>
+            </w:r>
+          </w:p>
+          <w:p>
+            <w:pPr>
+              <w:keepNext w:val="false"/>
+              <w:keepLines/>
+              <w:spacing w:after="60"/>
+            </w:pPr>
+            <w:r>
+              <w:rPr>
+                <w:b/>
+                <w:bCs/>
+                <w:color w:val="6B7785"/>
+              </w:rPr>
+              <w:t xml:space="preserve">Nota:</w:t>
+            </w:r>
+            <w:r>
+              <w:rPr>
+                <w:color w:val="6B7785"/>
+              </w:rPr>
+              <w:t xml:space="preserve"> Si queréis equilibrar tiempos, esta diapositiva la puede decir B (A ≈ 7,6 min y B ≈ 6,7 min).</w:t>
             </w:r>
           </w:p>
         </w:tc>
@@ -12834,7 +12804,7 @@
                 <w:sz w:val="26"/>
                 <w:szCs w:val="26"/>
               </w:rPr>
-              <w:t xml:space="preserve">20 · Discussion</w:t>
+              <w:t xml:space="preserve">20 · Conclusion</w:t>
             </w:r>
             <w:r>
               <w:rPr>
@@ -12842,7 +12812,7 @@
                 <w:sz w:val="22"/>
                 <w:szCs w:val="22"/>
               </w:rPr>
-              <w:t xml:space="preserve">     Habla: A  ·  ≈ 40 s</w:t>
+              <w:t xml:space="preserve">     Habla: B  ·  ≈ 35 s</w:t>
             </w:r>
           </w:p>
         </w:tc>
@@ -12937,7 +12907,7 @@
               <w:bottom w:val="single" w:color="C9D3DD" w:sz="4"/>
               <w:right w:val="single" w:color="C9D3DD" w:sz="4"/>
             </w:tcBorders>
-            <w:shd w:fill="E6F0F8" w:color="auto" w:val="clear"/>
+            <w:shd w:fill="FBEDE7" w:color="auto" w:val="clear"/>
             <w:tcMar>
               <w:top w:type="dxa" w:w="100"/>
               <w:left w:type="dxa" w:w="140"/>
@@ -12952,7 +12922,17 @@
               <w:spacing w:after="60"/>
             </w:pPr>
             <w:r>
-              <w:t xml:space="preserve">Nuestro estudio confirma que los aneurismas son frecuentes pero a menudo silenciosos, que la rotura es mortal y que el tratamiento precoz salva vidas. Sin embargo, tenemos limitaciones. Es solo un estudio bibliográfico, con datos de pocos países y ninguno de España. Además, no hay ensayos terminados para los aneurismas no rotos. Hace falta más investigación, sobre todo para saber cuándo tratar los aneurismas pequeños.</w:t>
+              <w:t xml:space="preserve">Para concluir, hemos cumplido nuestro objetivo. En primer lugar, un aneurisma no roto suele ser silencioso, así que los médicos deben decidir si vigilarlo o tratarlo. En segundo lugar, una rotura es una urgencia: </w:t>
+            </w:r>
+            <w:r>
+              <w:rPr>
+                <w:b/>
+                <w:bCs/>
+              </w:rPr>
+              <w:t xml:space="preserve">CT</w:t>
+            </w:r>
+            <w:r>
+              <w:t xml:space="preserve"> en menos de 6 horas y tratamiento en menos de 24 horas. En tercer lugar, la prevención (tensión arterial y no fumar) es tan importante como la cirugía. En nuestra opinión, un dolor de cabeza repentino e intenso nunca debe subestimarse.</w:t>
             </w:r>
           </w:p>
         </w:tc>
@@ -12965,7 +12945,7 @@
               <w:bottom w:val="single" w:color="C9D3DD" w:sz="4"/>
               <w:right w:val="single" w:color="C9D3DD" w:sz="4"/>
             </w:tcBorders>
-            <w:shd w:fill="E6F0F8" w:color="auto" w:val="clear"/>
+            <w:shd w:fill="FBEDE7" w:color="auto" w:val="clear"/>
             <w:tcMar>
               <w:top w:type="dxa" w:w="100"/>
               <w:left w:type="dxa" w:w="140"/>
@@ -12980,7 +12960,17 @@
               <w:spacing w:after="60"/>
             </w:pPr>
             <w:r>
-              <w:t xml:space="preserve">Our study confirms that aneurysms are common but often silent, that rupture is deadly, and that early treatment saves lives. However, we have limitations. This is only a bibliographic study, with data from few countries and none from Spain. Moreover, there are no completed trials for unruptured aneurysms. Further research is needed, especially to know when to treat small aneurysms.</w:t>
+              <w:t xml:space="preserve">To conclude, we achieved our objective. Firstly, an unruptured aneurysm is often silent, so doctors must decide to watch it or treat it. Secondly, a rupture is an emergency: </w:t>
+            </w:r>
+            <w:r>
+              <w:rPr>
+                <w:b/>
+                <w:bCs/>
+              </w:rPr>
+              <w:t xml:space="preserve">CT</w:t>
+            </w:r>
+            <w:r>
+              <w:t xml:space="preserve"> in less than 6 hours and treatment in less than 24 hours. Thirdly, prevention, blood pressure and no smoking, is as important as surgery. In our opinion, a sudden, severe headache must never be underestimated.</w:t>
             </w:r>
           </w:p>
         </w:tc>
@@ -13021,45 +13011,7 @@
               <w:t xml:space="preserve">Pronunciación:</w:t>
             </w:r>
             <w:r>
-              <w:t xml:space="preserve"> limitations /lim-ih-TAY-shunz/ · further /FUR-ther/ · deadly /DED-lee/ · research /ree-SURCH/</w:t>
-            </w:r>
-          </w:p>
-          <w:p>
-            <w:pPr>
-              <w:keepNext w:val="false"/>
-              <w:keepLines/>
-              <w:spacing w:after="60"/>
-            </w:pPr>
-            <w:r>
-              <w:rPr>
-                <w:b/>
-                <w:bCs/>
-              </w:rPr>
-              <w:t xml:space="preserve">Relevo:</w:t>
-            </w:r>
-            <w:r>
-              <w:t xml:space="preserve"> A → B: "Now my colleague will present the conclusion."</w:t>
-            </w:r>
-          </w:p>
-          <w:p>
-            <w:pPr>
-              <w:keepNext w:val="false"/>
-              <w:keepLines/>
-              <w:spacing w:after="60"/>
-            </w:pPr>
-            <w:r>
-              <w:rPr>
-                <w:b/>
-                <w:bCs/>
-                <w:color w:val="6B7785"/>
-              </w:rPr>
-              <w:t xml:space="preserve">Nota:</w:t>
-            </w:r>
-            <w:r>
-              <w:rPr>
-                <w:color w:val="6B7785"/>
-              </w:rPr>
-              <w:t xml:space="preserve"> Si queréis equilibrar tiempos, esta diapositiva la puede decir B (A ≈ 7,6 min y B ≈ 7,3 min).</w:t>
+              <w:t xml:space="preserve"> underestimated /un-der-ES-ti-may-tid/ · achieved /uh-CHEEVD/ · surgery /SUR-juh-ree/</w:t>
             </w:r>
           </w:p>
         </w:tc>
@@ -13123,7 +13075,7 @@
                 <w:sz w:val="26"/>
                 <w:szCs w:val="26"/>
               </w:rPr>
-              <w:t xml:space="preserve">21 · Conclusion</w:t>
+              <w:t xml:space="preserve">21 · Clinical case</w:t>
             </w:r>
             <w:r>
               <w:rPr>
@@ -13131,7 +13083,7 @@
                 <w:sz w:val="22"/>
                 <w:szCs w:val="22"/>
               </w:rPr>
-              <w:t xml:space="preserve">     Habla: B  ·  ≈ 35 s</w:t>
+              <w:t xml:space="preserve">     Habla: B  ·  ≈ 45 s</w:t>
             </w:r>
           </w:p>
         </w:tc>
@@ -13241,7 +13193,7 @@
               <w:spacing w:after="60"/>
             </w:pPr>
             <w:r>
-              <w:t xml:space="preserve">Para concluir, hemos cumplido nuestro objetivo. En primer lugar, un aneurisma no roto suele ser silencioso, así que los médicos deben decidir si vigilarlo o tratarlo. En segundo lugar, una rotura es una urgencia: </w:t>
+              <w:t xml:space="preserve">Por último, un caso clínico corto. No es un paciente real. Una mujer de 52 años, fumadora y con tensión alta, siente un dolor de cabeza terrible mientras levanta una caja. Vomita y tiene el cuello rígido. El </w:t>
             </w:r>
             <w:r>
               <w:rPr>
@@ -13251,7 +13203,37 @@
               <w:t xml:space="preserve">CT</w:t>
             </w:r>
             <w:r>
-              <w:t xml:space="preserve"> en menos de 6 horas y tratamiento en menos de 24 horas. En tercer lugar, la prevención (tensión arterial y no fumar) es tan importante como la cirugía. En nuestra opinión, un dolor de cabeza repentino e intenso nunca debe subestimarse.</w:t>
+              <w:t xml:space="preserve"> a las 3 horas muestra sangre, y la </w:t>
+            </w:r>
+            <w:r>
+              <w:rPr>
+                <w:b/>
+                <w:bCs/>
+              </w:rPr>
+              <w:t xml:space="preserve">CT angiography</w:t>
+            </w:r>
+            <w:r>
+              <w:t xml:space="preserve"> muestra un aneurisma de 6 mm. Se le hace </w:t>
+            </w:r>
+            <w:r>
+              <w:rPr>
+                <w:b/>
+                <w:bCs/>
+              </w:rPr>
+              <w:t xml:space="preserve">coiling</w:t>
+            </w:r>
+            <w:r>
+              <w:t xml:space="preserve"> a las 14 horas y recibe </w:t>
+            </w:r>
+            <w:r>
+              <w:rPr>
+                <w:b/>
+                <w:bCs/>
+              </w:rPr>
+              <w:t xml:space="preserve">nimodipine</w:t>
+            </w:r>
+            <w:r>
+              <w:t xml:space="preserve">. Tiene dos complicaciones, pero a los 3 meses es independiente. Gracias. ¿Tenéis alguna pregunta?</w:t>
             </w:r>
           </w:p>
         </w:tc>
@@ -13279,7 +13261,7 @@
               <w:spacing w:after="60"/>
             </w:pPr>
             <w:r>
-              <w:t xml:space="preserve">To conclude, we achieved our objective. Firstly, an unruptured aneurysm is often silent, so doctors must decide to watch it or treat it. Secondly, a rupture is an emergency: </w:t>
+              <w:t xml:space="preserve">Finally, a short clinical case. It is not a real patient. A 52-year-old woman, a smoker with high blood pressure, feels a terrible headache while she is lifting a box. She vomits and her neck is stiff. The </w:t>
             </w:r>
             <w:r>
               <w:rPr>
@@ -13289,7 +13271,37 @@
               <w:t xml:space="preserve">CT</w:t>
             </w:r>
             <w:r>
-              <w:t xml:space="preserve"> in less than 6 hours and treatment in less than 24 hours. Thirdly, prevention, blood pressure and no smoking, is as important as surgery. In our opinion, a sudden, severe headache must never be underestimated.</w:t>
+              <w:t xml:space="preserve"> at 3 hours shows blood, and </w:t>
+            </w:r>
+            <w:r>
+              <w:rPr>
+                <w:b/>
+                <w:bCs/>
+              </w:rPr>
+              <w:t xml:space="preserve">CT angiography</w:t>
+            </w:r>
+            <w:r>
+              <w:t xml:space="preserve"> shows a 6 mm aneurysm. It is </w:t>
+            </w:r>
+            <w:r>
+              <w:rPr>
+                <w:b/>
+                <w:bCs/>
+              </w:rPr>
+              <w:t xml:space="preserve">coiled</w:t>
+            </w:r>
+            <w:r>
+              <w:t xml:space="preserve"> at 14 hours and she receives </w:t>
+            </w:r>
+            <w:r>
+              <w:rPr>
+                <w:b/>
+                <w:bCs/>
+              </w:rPr>
+              <w:t xml:space="preserve">nimodipine</w:t>
+            </w:r>
+            <w:r>
+              <w:t xml:space="preserve">. She has two complications, but at 3 months she is independent. Thank you. Do you have any questions?</w:t>
             </w:r>
           </w:p>
         </w:tc>
@@ -13330,7 +13342,56 @@
               <w:t xml:space="preserve">Pronunciación:</w:t>
             </w:r>
             <w:r>
-              <w:t xml:space="preserve"> underestimated /un-der-ES-ti-may-tid/ · achieved /uh-CHEEVD/ · surgery /SUR-juh-ree/</w:t>
+              <w:t xml:space="preserve"> hydrocephalus /hy-droh-SEF-uh-lus/ · 52-year-old = "fifty-two-year-old" · 6 mm = "six millimetres"</w:t>
+            </w:r>
+          </w:p>
+          <w:p>
+            <w:pPr>
+              <w:keepNext w:val="false"/>
+              <w:keepLines/>
+              <w:spacing w:after="60"/>
+            </w:pPr>
+            <w:r>
+              <w:rPr>
+                <w:b/>
+                <w:bCs/>
+                <w:color w:val="6B7785"/>
+              </w:rPr>
+              <w:t xml:space="preserve">Nota:</w:t>
+            </w:r>
+            <w:r>
+              <w:rPr>
+                <w:color w:val="6B7785"/>
+              </w:rPr>
+              <w:t xml:space="preserve"> Las dos complicaciones (en la diapositiva): día 2 </w:t>
+            </w:r>
+            <w:r>
+              <w:rPr>
+                <w:b/>
+                <w:bCs/>
+                <w:color w:val="6B7785"/>
+              </w:rPr>
+              <w:t xml:space="preserve">hydrocephalus</w:t>
+            </w:r>
+            <w:r>
+              <w:rPr>
+                <w:color w:val="6B7785"/>
+              </w:rPr>
+              <w:t xml:space="preserve"> → drenaje; día 7 </w:t>
+            </w:r>
+            <w:r>
+              <w:rPr>
+                <w:b/>
+                <w:bCs/>
+                <w:color w:val="6B7785"/>
+              </w:rPr>
+              <w:t xml:space="preserve">vasospasm</w:t>
+            </w:r>
+            <w:r>
+              <w:rPr>
+                <w:color w:val="6B7785"/>
+              </w:rPr>
+              <w:t xml:space="preserve"> → tratado. Si preguntan, ver Parte 1.</w:t>
             </w:r>
           </w:p>
         </w:tc>
@@ -13394,387 +13455,7 @@
                 <w:sz w:val="26"/>
                 <w:szCs w:val="26"/>
               </w:rPr>
-              <w:t xml:space="preserve">22 · Clinical case</w:t>
-            </w:r>
-            <w:r>
-              <w:rPr>
-                <w:color w:val="D6E4F0"/>
-                <w:sz w:val="22"/>
-                <w:szCs w:val="22"/>
-              </w:rPr>
-              <w:t xml:space="preserve">     Habla: B  ·  ≈ 45 s</w:t>
-            </w:r>
-          </w:p>
-        </w:tc>
-      </w:tr>
-      <w:tr>
-        <w:trPr>
-          <w:cantSplit/>
-        </w:trPr>
-        <w:tc>
-          <w:tcPr>
-            <w:tcW w:type="dxa" w:w="4819"/>
-            <w:tcBorders>
-              <w:top w:val="single" w:color="C9D3DD" w:sz="4"/>
-              <w:left w:val="single" w:color="C9D3DD" w:sz="4"/>
-              <w:bottom w:val="single" w:color="C9D3DD" w:sz="4"/>
-              <w:right w:val="single" w:color="C9D3DD" w:sz="4"/>
-            </w:tcBorders>
-            <w:shd w:fill="DDE6EF" w:color="auto" w:val="clear"/>
-            <w:tcMar>
-              <w:top w:type="dxa" w:w="100"/>
-              <w:left w:type="dxa" w:w="140"/>
-              <w:bottom w:type="dxa" w:w="100"/>
-              <w:right w:type="dxa" w:w="140"/>
-            </w:tcMar>
-          </w:tcPr>
-          <w:p>
-            <w:pPr>
-              <w:keepNext/>
-              <w:keepLines/>
-              <w:spacing w:after="60"/>
-            </w:pPr>
-            <w:r>
-              <w:rPr>
-                <w:b/>
-                <w:bCs/>
-                <w:color w:val="0D2E5C"/>
-              </w:rPr>
-              <w:t xml:space="preserve">Español</w:t>
-            </w:r>
-          </w:p>
-        </w:tc>
-        <w:tc>
-          <w:tcPr>
-            <w:tcW w:type="dxa" w:w="4819"/>
-            <w:tcBorders>
-              <w:top w:val="single" w:color="C9D3DD" w:sz="4"/>
-              <w:left w:val="single" w:color="C9D3DD" w:sz="4"/>
-              <w:bottom w:val="single" w:color="C9D3DD" w:sz="4"/>
-              <w:right w:val="single" w:color="C9D3DD" w:sz="4"/>
-            </w:tcBorders>
-            <w:shd w:fill="DDE6EF" w:color="auto" w:val="clear"/>
-            <w:tcMar>
-              <w:top w:type="dxa" w:w="100"/>
-              <w:left w:type="dxa" w:w="140"/>
-              <w:bottom w:type="dxa" w:w="100"/>
-              <w:right w:type="dxa" w:w="140"/>
-            </w:tcMar>
-          </w:tcPr>
-          <w:p>
-            <w:pPr>
-              <w:keepNext/>
-              <w:keepLines/>
-              <w:spacing w:after="60"/>
-            </w:pPr>
-            <w:r>
-              <w:rPr>
-                <w:b/>
-                <w:bCs/>
-                <w:color w:val="0D2E5C"/>
-              </w:rPr>
-              <w:t xml:space="preserve">English</w:t>
-            </w:r>
-            <w:r>
-              <w:rPr>
-                <w:color w:val="0D2E5C"/>
-              </w:rPr>
-              <w:t xml:space="preserve"> (lo que se dice)</w:t>
-            </w:r>
-          </w:p>
-        </w:tc>
-      </w:tr>
-      <w:tr>
-        <w:trPr>
-          <w:cantSplit/>
-        </w:trPr>
-        <w:tc>
-          <w:tcPr>
-            <w:tcW w:type="dxa" w:w="4819"/>
-            <w:tcBorders>
-              <w:top w:val="single" w:color="C9D3DD" w:sz="4"/>
-              <w:left w:val="single" w:color="C9D3DD" w:sz="4"/>
-              <w:bottom w:val="single" w:color="C9D3DD" w:sz="4"/>
-              <w:right w:val="single" w:color="C9D3DD" w:sz="4"/>
-            </w:tcBorders>
-            <w:shd w:fill="FBEDE7" w:color="auto" w:val="clear"/>
-            <w:tcMar>
-              <w:top w:type="dxa" w:w="100"/>
-              <w:left w:type="dxa" w:w="140"/>
-              <w:bottom w:type="dxa" w:w="100"/>
-              <w:right w:type="dxa" w:w="140"/>
-            </w:tcMar>
-          </w:tcPr>
-          <w:p>
-            <w:pPr>
-              <w:keepNext/>
-              <w:keepLines/>
-              <w:spacing w:after="60"/>
-            </w:pPr>
-            <w:r>
-              <w:t xml:space="preserve">Por último, un caso clínico corto. No es un paciente real. Una mujer de 52 años, fumadora y con tensión alta, siente un dolor de cabeza terrible mientras levanta una caja. Vomita y tiene el cuello rígido. El </w:t>
-            </w:r>
-            <w:r>
-              <w:rPr>
-                <w:b/>
-                <w:bCs/>
-              </w:rPr>
-              <w:t xml:space="preserve">CT</w:t>
-            </w:r>
-            <w:r>
-              <w:t xml:space="preserve"> a las 3 horas muestra sangre, y la </w:t>
-            </w:r>
-            <w:r>
-              <w:rPr>
-                <w:b/>
-                <w:bCs/>
-              </w:rPr>
-              <w:t xml:space="preserve">CT angiography</w:t>
-            </w:r>
-            <w:r>
-              <w:t xml:space="preserve"> muestra un aneurisma de 6 mm. Se le hace </w:t>
-            </w:r>
-            <w:r>
-              <w:rPr>
-                <w:b/>
-                <w:bCs/>
-              </w:rPr>
-              <w:t xml:space="preserve">coiling</w:t>
-            </w:r>
-            <w:r>
-              <w:t xml:space="preserve"> a las 14 horas y recibe </w:t>
-            </w:r>
-            <w:r>
-              <w:rPr>
-                <w:b/>
-                <w:bCs/>
-              </w:rPr>
-              <w:t xml:space="preserve">nimodipine</w:t>
-            </w:r>
-            <w:r>
-              <w:t xml:space="preserve">. Tiene dos complicaciones, pero a los 3 meses es independiente. Gracias. ¿Tenéis alguna pregunta?</w:t>
-            </w:r>
-          </w:p>
-        </w:tc>
-        <w:tc>
-          <w:tcPr>
-            <w:tcW w:type="dxa" w:w="4819"/>
-            <w:tcBorders>
-              <w:top w:val="single" w:color="C9D3DD" w:sz="4"/>
-              <w:left w:val="single" w:color="C9D3DD" w:sz="4"/>
-              <w:bottom w:val="single" w:color="C9D3DD" w:sz="4"/>
-              <w:right w:val="single" w:color="C9D3DD" w:sz="4"/>
-            </w:tcBorders>
-            <w:shd w:fill="FBEDE7" w:color="auto" w:val="clear"/>
-            <w:tcMar>
-              <w:top w:type="dxa" w:w="100"/>
-              <w:left w:type="dxa" w:w="140"/>
-              <w:bottom w:type="dxa" w:w="100"/>
-              <w:right w:type="dxa" w:w="140"/>
-            </w:tcMar>
-          </w:tcPr>
-          <w:p>
-            <w:pPr>
-              <w:keepNext/>
-              <w:keepLines/>
-              <w:spacing w:after="60"/>
-            </w:pPr>
-            <w:r>
-              <w:t xml:space="preserve">Finally, a short clinical case. It is not a real patient. A 52-year-old woman, a smoker with high blood pressure, feels a terrible headache while she is lifting a box. She vomits and her neck is stiff. The </w:t>
-            </w:r>
-            <w:r>
-              <w:rPr>
-                <w:b/>
-                <w:bCs/>
-              </w:rPr>
-              <w:t xml:space="preserve">CT</w:t>
-            </w:r>
-            <w:r>
-              <w:t xml:space="preserve"> at 3 hours shows blood, and </w:t>
-            </w:r>
-            <w:r>
-              <w:rPr>
-                <w:b/>
-                <w:bCs/>
-              </w:rPr>
-              <w:t xml:space="preserve">CT angiography</w:t>
-            </w:r>
-            <w:r>
-              <w:t xml:space="preserve"> shows a 6 mm aneurysm. It is </w:t>
-            </w:r>
-            <w:r>
-              <w:rPr>
-                <w:b/>
-                <w:bCs/>
-              </w:rPr>
-              <w:t xml:space="preserve">coiled</w:t>
-            </w:r>
-            <w:r>
-              <w:t xml:space="preserve"> at 14 hours and she receives </w:t>
-            </w:r>
-            <w:r>
-              <w:rPr>
-                <w:b/>
-                <w:bCs/>
-              </w:rPr>
-              <w:t xml:space="preserve">nimodipine</w:t>
-            </w:r>
-            <w:r>
-              <w:t xml:space="preserve">. She has two complications, but at 3 months she is independent. Thank you. Do you have any questions?</w:t>
-            </w:r>
-          </w:p>
-        </w:tc>
-      </w:tr>
-      <w:tr>
-        <w:trPr>
-          <w:cantSplit/>
-        </w:trPr>
-        <w:tc>
-          <w:tcPr>
-            <w:tcW w:type="dxa" w:w="9638"/>
-            <w:gridSpan w:val="2"/>
-            <w:tcBorders>
-              <w:top w:val="single" w:color="C9D3DD" w:sz="4"/>
-              <w:left w:val="single" w:color="C9D3DD" w:sz="4"/>
-              <w:bottom w:val="single" w:color="C9D3DD" w:sz="4"/>
-              <w:right w:val="single" w:color="C9D3DD" w:sz="4"/>
-            </w:tcBorders>
-            <w:shd w:fill="FFFFFF" w:color="auto" w:val="clear"/>
-            <w:tcMar>
-              <w:top w:type="dxa" w:w="100"/>
-              <w:left w:type="dxa" w:w="140"/>
-              <w:bottom w:type="dxa" w:w="100"/>
-              <w:right w:type="dxa" w:w="140"/>
-            </w:tcMar>
-          </w:tcPr>
-          <w:p>
-            <w:pPr>
-              <w:keepNext w:val="false"/>
-              <w:keepLines/>
-              <w:spacing w:after="60"/>
-            </w:pPr>
-            <w:r>
-              <w:rPr>
-                <w:b/>
-                <w:bCs/>
-              </w:rPr>
-              <w:t xml:space="preserve">Pronunciación:</w:t>
-            </w:r>
-            <w:r>
-              <w:t xml:space="preserve"> hydrocephalus /hy-droh-SEF-uh-lus/ · 52-year-old = "fifty-two-year-old" · 6 mm = "six millimetres"</w:t>
-            </w:r>
-          </w:p>
-          <w:p>
-            <w:pPr>
-              <w:keepNext w:val="false"/>
-              <w:keepLines/>
-              <w:spacing w:after="60"/>
-            </w:pPr>
-            <w:r>
-              <w:rPr>
-                <w:b/>
-                <w:bCs/>
-                <w:color w:val="6B7785"/>
-              </w:rPr>
-              <w:t xml:space="preserve">Nota:</w:t>
-            </w:r>
-            <w:r>
-              <w:rPr>
-                <w:color w:val="6B7785"/>
-              </w:rPr>
-              <w:t xml:space="preserve"> Las dos complicaciones (en la diapositiva): día 2 </w:t>
-            </w:r>
-            <w:r>
-              <w:rPr>
-                <w:b/>
-                <w:bCs/>
-                <w:color w:val="6B7785"/>
-              </w:rPr>
-              <w:t xml:space="preserve">hydrocephalus</w:t>
-            </w:r>
-            <w:r>
-              <w:rPr>
-                <w:color w:val="6B7785"/>
-              </w:rPr>
-              <w:t xml:space="preserve"> → drenaje; día 7 </w:t>
-            </w:r>
-            <w:r>
-              <w:rPr>
-                <w:b/>
-                <w:bCs/>
-                <w:color w:val="6B7785"/>
-              </w:rPr>
-              <w:t xml:space="preserve">vasospasm</w:t>
-            </w:r>
-            <w:r>
-              <w:rPr>
-                <w:color w:val="6B7785"/>
-              </w:rPr>
-              <w:t xml:space="preserve"> → tratado. Si preguntan, ver Parte 1.</w:t>
-            </w:r>
-          </w:p>
-        </w:tc>
-      </w:tr>
-    </w:tbl>
-    <w:p>
-      <w:pPr>
-        <w:spacing w:after="120"/>
-      </w:pPr>
-    </w:p>
-    <w:tbl>
-      <w:tblPr>
-        <w:tblW w:type="dxa" w:w="9638"/>
-        <w:tblBorders>
-          <w:top w:val="single" w:color="auto" w:sz="4"/>
-          <w:left w:val="single" w:color="auto" w:sz="4"/>
-          <w:bottom w:val="single" w:color="auto" w:sz="4"/>
-          <w:right w:val="single" w:color="auto" w:sz="4"/>
-          <w:insideH w:val="single" w:color="auto" w:sz="4"/>
-          <w:insideV w:val="single" w:color="auto" w:sz="4"/>
-        </w:tblBorders>
-        <w:tblLayout w:type="fixed"/>
-      </w:tblPr>
-      <w:tblGrid>
-        <w:gridCol w:w="4819"/>
-        <w:gridCol w:w="4819"/>
-      </w:tblGrid>
-      <w:tr>
-        <w:trPr>
-          <w:cantSplit/>
-          <w:tblHeader/>
-        </w:trPr>
-        <w:tc>
-          <w:tcPr>
-            <w:tcW w:type="dxa" w:w="9638"/>
-            <w:gridSpan w:val="2"/>
-            <w:tcBorders>
-              <w:top w:val="single" w:color="C9D3DD" w:sz="4"/>
-              <w:left w:val="single" w:color="C9D3DD" w:sz="4"/>
-              <w:bottom w:val="single" w:color="C9D3DD" w:sz="4"/>
-              <w:right w:val="single" w:color="C9D3DD" w:sz="4"/>
-            </w:tcBorders>
-            <w:shd w:fill="0D2E5C" w:color="auto" w:val="clear"/>
-            <w:tcMar>
-              <w:top w:type="dxa" w:w="100"/>
-              <w:left w:type="dxa" w:w="140"/>
-              <w:bottom w:type="dxa" w:w="100"/>
-              <w:right w:type="dxa" w:w="140"/>
-            </w:tcMar>
-          </w:tcPr>
-          <w:p>
-            <w:pPr>
-              <w:keepNext/>
-              <w:spacing w:after="0"/>
-            </w:pPr>
-            <w:r>
-              <w:rPr>
-                <w:b/>
-                <w:bCs/>
-                <w:color w:val="FFFFFF"/>
-                <w:sz w:val="26"/>
-                <w:szCs w:val="26"/>
-              </w:rPr>
-              <w:t xml:space="preserve">23 · Questions</w:t>
+              <w:t xml:space="preserve">22 · Questions</w:t>
             </w:r>
             <w:r>
               <w:rPr>

</xml_diff>